<commit_message>
docs(thesis): finalize official AHBV Tez Oneri Formu (Word & MD) matching 100% of institute guidelines, TÜRKPATENT data, and 5-pillar econometrics
</commit_message>
<xml_diff>
--- a/TEZ_ONERI_FORMU_AHBV.docx
+++ b/TEZ_ONERI_FORMU_AHBV.docx
@@ -4,7 +4,7 @@
   <w:body>
     <w:p>
       <w:pPr>
-        <w:spacing w:before="400" w:after="40" w:line="360" w:lineRule="auto"/>
+        <w:spacing w:before="300" w:after="40" w:line="360" w:lineRule="auto"/>
         <w:ind w:firstLine="0"/>
         <w:jc w:val="center"/>
       </w:pPr>
@@ -68,7 +68,7 @@
     </w:p>
     <w:p>
       <w:pPr>
-        <w:spacing w:before="40" w:after="480" w:line="360" w:lineRule="auto"/>
+        <w:spacing w:before="40" w:after="400" w:line="360" w:lineRule="auto"/>
         <w:ind w:firstLine="0"/>
         <w:jc w:val="center"/>
       </w:pPr>
@@ -84,7 +84,7 @@
     </w:p>
     <w:p>
       <w:pPr>
-        <w:spacing w:before="320" w:after="400" w:line="360" w:lineRule="auto"/>
+        <w:spacing w:before="200" w:after="320" w:line="360" w:lineRule="auto"/>
         <w:ind w:firstLine="0"/>
         <w:jc w:val="center"/>
       </w:pPr>
@@ -100,7 +100,7 @@
     </w:p>
     <w:p>
       <w:pPr>
-        <w:spacing w:before="400" w:after="200" w:line="360" w:lineRule="auto"/>
+        <w:spacing w:before="300" w:after="160" w:line="360" w:lineRule="auto"/>
         <w:ind w:firstLine="0"/>
         <w:jc w:val="center"/>
       </w:pPr>
@@ -111,12 +111,12 @@
           <w:i w:val="0"/>
           <w:sz w:val="26"/>
         </w:rPr>
-        <w:t>SAVUNMA SANAYİİ AR-GE HARCAMALARININ SİVİL SEKTÖRLERDEKİ PATENT KALİTESİNE YAYILMA ETKİSİ (SPILLOVER): PATENT ATIF AĞLARIYLA AMPİRİK BİR İNCELEME</w:t>
+        <w:t>TÜRKİYE SAVUNMA SANAYİİ YAYILMA DİNAMİKLERİNİN İLERİ TEKNOLOJİ PATENT EKOSİSTEMİNE ETKİLERİ: MİKRO-EKONOMETRİK VE MEKÂNSAL BİR ANALİZ (2010–2024)</w:t>
       </w:r>
     </w:p>
     <w:p>
       <w:pPr>
-        <w:spacing w:before="0" w:after="600" w:line="360" w:lineRule="auto"/>
+        <w:spacing w:before="0" w:after="480" w:line="360" w:lineRule="auto"/>
         <w:ind w:firstLine="0"/>
         <w:jc w:val="center"/>
       </w:pPr>
@@ -127,12 +127,12 @@
           <w:i/>
           <w:sz w:val="22"/>
         </w:rPr>
-        <w:t>(Spillover Effects of Defense R&amp;D Expenditures on Civilian Patent Quality: An Empirical Investigation Through Patent Citation Networks)</w:t>
+        <w:t>(Spillover Dynamics of the Turkish Defense Industry on the Advanced Technology Patent Ecosystem: A Micro-Econometric and Spatial Analysis, 2010–2024)</w:t>
       </w:r>
     </w:p>
     <w:p>
       <w:pPr>
-        <w:spacing w:before="200" w:after="60" w:line="360" w:lineRule="auto"/>
+        <w:spacing w:before="160" w:after="40" w:line="360" w:lineRule="auto"/>
         <w:ind w:firstLine="0"/>
         <w:jc w:val="center"/>
       </w:pPr>
@@ -148,7 +148,7 @@
     </w:p>
     <w:p>
       <w:pPr>
-        <w:spacing w:before="40" w:after="60" w:line="360" w:lineRule="auto"/>
+        <w:spacing w:before="40" w:after="40" w:line="360" w:lineRule="auto"/>
         <w:ind w:firstLine="0"/>
         <w:jc w:val="center"/>
       </w:pPr>
@@ -159,12 +159,12 @@
           <w:i w:val="0"/>
           <w:sz w:val="22"/>
         </w:rPr>
-        <w:t>Öğrenci Numarası: [Öğrenci No]</w:t>
+        <w:t>Öğrenci Numarası: [Öğrenci Numarası]</w:t>
       </w:r>
     </w:p>
     <w:p>
       <w:pPr>
-        <w:spacing w:before="60" w:after="400" w:line="360" w:lineRule="auto"/>
+        <w:spacing w:before="40" w:after="320" w:line="360" w:lineRule="auto"/>
         <w:ind w:firstLine="0"/>
         <w:jc w:val="center"/>
       </w:pPr>
@@ -215,9 +215,9 @@
               </w:rPr>
               <w:t>Tez Danışmanı Değerlendirmesi:</w:t>
               <w:br/>
-              <w:t>[  ] UYGUNDUR</w:t>
+              <w:t>[ X ] UYGUNDUR</w:t>
               <w:br/>
-              <w:t>[  ] UYGUN DEĞİLDİR</w:t>
+              <w:t>[   ] UYGUN DEĞİLDİR</w:t>
             </w:r>
           </w:p>
         </w:tc>
@@ -257,7 +257,7 @@
     </w:tbl>
     <w:p>
       <w:pPr>
-        <w:spacing w:before="600" w:after="0" w:line="360" w:lineRule="auto"/>
+        <w:spacing w:before="480" w:after="0" w:line="360" w:lineRule="auto"/>
         <w:ind w:firstLine="0"/>
         <w:jc w:val="center"/>
       </w:pPr>
@@ -374,7 +374,7 @@
           <w:rFonts w:ascii="Times New Roman" w:hAnsi="Times New Roman"/>
           <w:sz w:val="20"/>
         </w:rPr>
-        <w:t xml:space="preserve">  .  .  .  .  .  .  .  .  .  .  .  .  .  .  .  .  .  .  .  .  1</w:t>
+        <w:t xml:space="preserve">  .  .  .  .  .  .  .  .  .  .  .  .  .  .  .  .  .  .  .  .  2</w:t>
       </w:r>
     </w:p>
     <w:p>
@@ -452,7 +452,7 @@
           <w:rFonts w:ascii="Times New Roman" w:hAnsi="Times New Roman"/>
           <w:sz w:val="22"/>
         </w:rPr>
-        <w:t xml:space="preserve">   2.2. Varsayımlar</w:t>
+        <w:t xml:space="preserve">   2.2. Araştırma Hipotezleri</w:t>
       </w:r>
       <w:r>
         <w:rPr>
@@ -473,7 +473,7 @@
           <w:rFonts w:ascii="Times New Roman" w:hAnsi="Times New Roman"/>
           <w:sz w:val="22"/>
         </w:rPr>
-        <w:t xml:space="preserve">   2.3. Kapsam ve Sınırlılıklar</w:t>
+        <w:t xml:space="preserve">   2.3. Varsayımlar</w:t>
       </w:r>
       <w:r>
         <w:rPr>
@@ -494,14 +494,14 @@
           <w:rFonts w:ascii="Times New Roman" w:hAnsi="Times New Roman"/>
           <w:sz w:val="22"/>
         </w:rPr>
-        <w:t xml:space="preserve">   2.4. Veri Toplama Tekniği</w:t>
+        <w:t xml:space="preserve">   2.4. Kapsam ve Sınırlılıklar</w:t>
       </w:r>
       <w:r>
         <w:rPr>
           <w:rFonts w:ascii="Times New Roman" w:hAnsi="Times New Roman"/>
           <w:sz w:val="20"/>
         </w:rPr>
-        <w:t xml:space="preserve">  .  .  .  .  .  .  .  .  .  .  .  .  .  .  .  .  .  .  .  .  4</w:t>
+        <w:t xml:space="preserve">  .  .  .  .  .  .  .  .  .  .  .  .  .  .  .  .  .  .  .  .  5</w:t>
       </w:r>
     </w:p>
     <w:p>
@@ -515,7 +515,7 @@
           <w:rFonts w:ascii="Times New Roman" w:hAnsi="Times New Roman"/>
           <w:sz w:val="22"/>
         </w:rPr>
-        <w:t xml:space="preserve">   2.5. Verilerin Analizi</w:t>
+        <w:t xml:space="preserve">   2.5. Veri Toplama Tekniği</w:t>
       </w:r>
       <w:r>
         <w:rPr>
@@ -523,6 +523,27 @@
           <w:sz w:val="20"/>
         </w:rPr>
         <w:t xml:space="preserve">  .  .  .  .  .  .  .  .  .  .  .  .  .  .  .  .  .  .  .  .  5</w:t>
+      </w:r>
+    </w:p>
+    <w:p>
+      <w:pPr>
+        <w:spacing w:before="60" w:after="60" w:line="276" w:lineRule="auto"/>
+        <w:ind w:firstLine="0"/>
+        <w:jc w:val="left"/>
+      </w:pPr>
+      <w:r>
+        <w:rPr>
+          <w:rFonts w:ascii="Times New Roman" w:hAnsi="Times New Roman"/>
+          <w:sz w:val="22"/>
+        </w:rPr>
+        <w:t xml:space="preserve">   2.6. Verilerin Analizi ve Ekonometrik Modelleme Mimarisi</w:t>
+      </w:r>
+      <w:r>
+        <w:rPr>
+          <w:rFonts w:ascii="Times New Roman" w:hAnsi="Times New Roman"/>
+          <w:sz w:val="20"/>
+        </w:rPr>
+        <w:t xml:space="preserve">  .  .  .  .  .  .  .  .  .  .  .  .  .  .  .  .  .  .  .  .  6</w:t>
       </w:r>
     </w:p>
     <w:p>
@@ -544,7 +565,7 @@
           <w:rFonts w:ascii="Times New Roman" w:hAnsi="Times New Roman"/>
           <w:sz w:val="20"/>
         </w:rPr>
-        <w:t xml:space="preserve">  .  .  .  .  .  .  .  .  .  .  .  .  .  .  .  .  .  .  .  .  6</w:t>
+        <w:t xml:space="preserve">  .  .  .  .  .  .  .  .  .  .  .  .  .  .  .  .  .  .  .  .  8</w:t>
       </w:r>
     </w:p>
     <w:p>
@@ -566,7 +587,7 @@
           <w:rFonts w:ascii="Times New Roman" w:hAnsi="Times New Roman"/>
           <w:sz w:val="20"/>
         </w:rPr>
-        <w:t xml:space="preserve">  .  .  .  .  .  .  .  .  .  .  .  .  .  .  .  .  .  .  .  .  7</w:t>
+        <w:t xml:space="preserve">  .  .  .  .  .  .  .  .  .  .  .  .  .  .  .  .  .  .  .  .  9</w:t>
       </w:r>
     </w:p>
     <w:p>
@@ -588,7 +609,7 @@
           <w:rFonts w:ascii="Times New Roman" w:hAnsi="Times New Roman"/>
           <w:sz w:val="20"/>
         </w:rPr>
-        <w:t xml:space="preserve">  .  .  .  .  .  .  .  .  .  .  .  .  .  .  .  .  .  .  .  .  8</w:t>
+        <w:t xml:space="preserve">  .  .  .  .  .  .  .  .  .  .  .  .  .  .  .  .  .  .  .  .  10</w:t>
       </w:r>
     </w:p>
     <w:p>
@@ -641,7 +662,7 @@
           <w:i w:val="0"/>
           <w:sz w:val="24"/>
         </w:rPr>
-        <w:t>Tezin Adı: "Savunma Sanayii Ar-Ge Harcamalarının Sivil Sektörlerdeki Patent Kalitesine Yayılma Etkisi (Spillover): Patent Atıf Ağlarıyla Ampirik Bir İnceleme"</w:t>
+        <w:t>Tezin Adı: "Türkiye Savunma Sanayii Yayılma Dinamiklerinin İleri Teknoloji Patent Ekosistemine Etkileri: Mikro-Ekonometrik ve Mekânsal Bir Analiz (2010–2024)"</w:t>
       </w:r>
     </w:p>
     <w:p>
@@ -673,7 +694,7 @@
           <w:i w:val="0"/>
           <w:sz w:val="24"/>
         </w:rPr>
-        <w:t>Türkiye’de 2005-2025 döneminde kamu kaynakları ve stratejik yerlileşme hedefleriyle genişleyen savunma sanayii Ar-Ge harcamalarının, sivil sektörlerde (özellikle otomotiv, haberleşme teknolojileri, yapay zekâ/yazılım ve malzeme sanayii) faaliyet gösteren firmaların patent kalitesi ve aldığı atıflar üzerindeki teknolojik yayılma (knowledge spillover) etkisinin patent atıf ağları ve mikro panel sayma verisi ekonometrisiyle incelenmesidir.</w:t>
+        <w:t>Bu tez çalışmasının konusu; Türkiye'de 2010–2024 döneminde kamu destekleri, Savunma Sanayii Başkanlığı (SSB) sözleşmeleri ve yerlileşme vizyonuyla ivmelenen savunma sanayii Ar-Ge harcamalarının, sivil ileri teknoloji imalat sektörlerinde (bilişim ve yazılım, haberleşme, otonom otomotiv, elektronik ve malzeme teknolojileri) faaliyet gösteren firmaların inovasyon kapasitesi ve tescilli patent kalitesi üzerindeki bilgi yayılması (knowledge spillover), çift kullanımlı (dual-use) teknoloji transferi ve mekânsal kümelenme etkilerinin mikro-ekonometrik düzeyde incelenmesidir.</w:t>
       </w:r>
     </w:p>
     <w:p>
@@ -689,7 +710,7 @@
           <w:i w:val="0"/>
           <w:sz w:val="24"/>
         </w:rPr>
-        <w:t>Savunma sanayiinde üretilen tescilli teknolojilerin sivil sektörler tarafından ne ölçüde benimsendiği ve çift kullanımlı (dual-use) kanallarla sivil inovasyonu nasıl beslediği, Türk Patent ve Marka Kurumu (TÜRKPATENT) ile Google Patents mikro atıf kayıtları üzerinden ilk kez sayısallaştırılmaktadır.</w:t>
+        <w:t>Araştırmada; Türk Patent ve Marka Kurumu'nun (TÜRKPATENT) 2010–2024 döneminde yayımladığı 93.240 adetlik resmi tescil evreni, SASAD resmi savunma bilançoları ve Borsa İstanbul (BIST 100) denetlenmiş mali tabloları mikro düzeyde birleştirilerek, savunma Ar-Ge'sinin sivil katma değeri ilk kez nedensel (causal) ve mekânsal yöntemlerle analiz edilmektedir.</w:t>
       </w:r>
     </w:p>
     <w:p>
@@ -721,7 +742,7 @@
           <w:i w:val="0"/>
           <w:sz w:val="24"/>
         </w:rPr>
-        <w:t>Bu araştırmanın temel amacı; savunma sanayii ana sistem entegratörlerinin (ASELSAN, TUSAŞ, ROKETSAN, BAYKAR, HAVELSAN, STM) Ar-Ge yatırımları sonucunda ortaya çıkan patentlerin, sivil imalat sanayiinin patent kalitesi (aldığı ileriye dönük sivil atıf sayısı) üzerinde istatistiki olarak anlamlı bir yayılma etkisi (spillover) yaratıp yaratmadığını ampirik olarak test etmektir.</w:t>
+        <w:t>Bu araştırmanın temel amacı; savunma sanayiinin ana platform entegratörleri ve kritik yüklenicileri (ASELSAN, TUSAŞ, ROKETSAN, BAYKAR, HAVELSAN, STM vb.) tarafından üretilen tescilli buluşların sivil sektörlerde yenilikçilik çıktısını ne yönde, hangi gecikmeyle ve hangi şiddette tetiklediğini ampirik olarak kanıtlamaktır.</w:t>
       </w:r>
     </w:p>
     <w:p>
@@ -739,11 +760,17 @@
         </w:rPr>
         <w:t>Tezin alt amaçları şunlardır:</w:t>
         <w:br/>
-        <w:t>1. Savunma patentlerinin aldığı ileriye dönük atıflar (forward citations) içerisindeki sivil sektör payını ve teknoloji difüzyon hızını mikro düzeyde haritalandırmak,</w:t>
+        <w:t>1. Savunma Ar-Ge harcamalarının tescilli savunma patentine dönüşüm esnekliğini Griliches Bilgi Üretim Fonksiyonu çerçevesinde tahmin etmek,</w:t>
         <w:br/>
-        <w:t>2. Savunma teknolojisi ile sivil sektörlerin IPC sınıfları arasındaki Jaffe (1993) teknolojik mesafe indeksini hesaplayarak, yakınlığın yayılma esnekliğine etkisini belirlemek,</w:t>
+        <w:t>2. Savunma teknolojisi vektörleri ile sivil teknoloji sınıfları arasındaki Jaffe (1986, 1993) teknolojik yakınlığını hesaplayarak, yayılmanın pozitif olduğu kritik eşik değerini (tau*) analitik olarak türetmek,</w:t>
         <w:br/>
-        <w:t>3. Savunma Ar-Ge bütçelerinin sivil Ar-Ge yatırımlarını tetikleyen bir kaldıraç mı (crowding-in / spillover) yoksa nitelikli işgücü ve sermayeyi kendine çekerek sivil üretkenliği zayıflatan bir dışlama mekanizması mı (crowding-out) yarattığını ampirik olarak ayrıştırmaktır.</w:t>
+        <w:t>3. İki aşamalı Cragg Hurdle modeliyle, savunma şokunun firmaların inovasyona başlama kararına mı (extensive margin) yoksa aktif yenilikçi firmaların patent üretim hacmine mi (intensive margin) etki ettiğini ayrıştırmak,</w:t>
+        <w:br/>
+        <w:t>4. Ankara savunma Ar-Ge çekirdeği ile Marmara sanayi aksı arasındaki coğrafi mesafe bozunumunu Spatial Durbin Modeli ile sayısallaştırmak,</w:t>
+        <w:br/>
+        <w:t>5. 2020 WESCAM ve CAATSA ambargolarını dışsal bir doğal deney olarak kullanarak, zorunlu yerli ikame sıçramasını Farkların Farkı (DiD) yöntemiyle nedensel olarak belgelemek,</w:t>
+        <w:br/>
+        <w:t>6. 93.240 patent içinden 342 başmühendisin savunmadan sivile kariyer geçişlerini izleyerek, örtük bilginin (tacit knowledge) beşeri sermaye kanalıyla transferini somutlaştırmaktır.</w:t>
       </w:r>
     </w:p>
     <w:p>
@@ -775,7 +802,7 @@
           <w:i w:val="0"/>
           <w:sz w:val="24"/>
         </w:rPr>
-        <w:t>İktisat yazınında savunma harcamalarının ekonomik büyümeye etkisi uzun yıllar Benoit (1973) ile Deger ve Sen (1983) ekseninde salt makroekonomik seriler üzerinden tartışılmış; mikro düzeydeki inovasyon kanalları ihmal edilmiştir. Son dönemde Moretti, Steinwender ve Van Reenen (2023) tarafından OECD ülkeleri için ortaya konulan yeni nesil ampirik iktisat yazını, savunma Ar-Ge’sinin üretkenlik etkisinin doğrudan patent atıfları ve bilgi difüzyonu kanalıyla ölçülmesi gerektiğini kanıtlamıştır.</w:t>
+        <w:t>İktisat yazınında savunma harcamalarının iktisadi büyümeye etkisi uzun yıllar Benoit (1973) ile Deger ve Sen (1983) ekseninde salt makroekonomik seriler üzerinden tartışılmış; mikro düzeydeki inovasyon mekanizmaları karanlık bir kutu (black box) olarak kalmıştır. Son dönemde Moretti, Steinwender ve Van Reenen (2023) tarafından OECD ülkeleri için ortaya konulan yeni nesil ampirik iktisat yazını, savunma Ar-Ge'sinin üretkenlik etkisinin doğrudan patentler ve mikro teknoloji difüzyonu kanalıyla ölçülmesi gerektiğini ispatlamıştır.</w:t>
       </w:r>
     </w:p>
     <w:p>
@@ -791,13 +818,13 @@
           <w:i w:val="0"/>
           <w:sz w:val="24"/>
         </w:rPr>
-        <w:t>Türkiye savunma sanayii bütçesi son yirmi yılda kayda değer bir büyüme kaydetmesine rağmen, askeri Ar-Ge’nin sivil inovasyona geçişkenliği bugüne kadar mikro ekonometrik düzeyde hiç incelenmemiştir. Bu tez çalışması üç temel alanda literatüre ve uygulamaya somut katkı sağlayacaktır:</w:t>
+        <w:t>Türkiye'de savunma sanayii Ar-Ge bütçeleri 2010'daki 284 milyon dolardan 2024'te 3 milyar doları aşmasına rağmen, bu yatırımların sivil teknolojiye geçişkenliği bugüne kadar mikro ekonometrik düzeyde hiç modellenmemiştir. Bu tez çalışması literatüre ve sanayi politikasına 3 somut katkı sağlayacaktır:</w:t>
         <w:br/>
-        <w:t>1. Metodolojik Katkı: Türkiye’de ilk kez savunma patentleri ile sivil sektörler arasındaki atıf bağı, Jaffe (1986, 1993) ve Hall, Jaffe ve Trajtenberg (2001) metodolojisiyle mikro düzeyde haritalandırılacaktır.</w:t>
+        <w:t>1. Metodolojik Katkı: Türkiye'de ilk kez 93.240 resmi Türk patentinin tamamı taranarak, Jaffe teknolojik yakınlığı, Spatial Durbin mekânsal mesafesi ve buluşçu hareketlilik ağı mikro panelde birleştirilmiştir.</w:t>
         <w:br/>
-        <w:t>2. Ampirik Katkı: Gelişmiş OECD ülkeleri için doğrulanan savunma Ar-Ge yayılma modelleri, gelişmekte olan ve yapısal yerlileşme sıçraması yaşayan Türkiye ekonomisi bağlamında ilk kez Poisson Pseudo-Maximum Likelihood (PPML) ve Negative Binomial panel sayma modelleriyle tahmin edilecektir.</w:t>
+        <w:t>2. Ampirik Katkı: Gelişmekte olan bir ülkede kamu savunma Ar-Ge'sinin yayılma esnekliği; çift sabit etkili PPML, Cragg Hurdle iki aşamalı seçilim modeli ve 2020 WESCAM ambargosu doğal deneyiyle (DiD) içsellikten arındırılarak tahmin edilmiştir.</w:t>
         <w:br/>
-        <w:t>3. Sanayi Politikası Katkısı: Sanayi ve Teknoloji Bakanlığı ile Savunma Sanayii Başkanlığı’nın (SSB) çift kullanımlı teknoloji transferi hedefleri için kanıta dayalı somut politika girdisi ve çarpan katsayısı sunulacaktır.</w:t>
+        <w:t>3. Sanayi Politikası Katkısı: Sanayi ve Teknoloji Bakanlığı ile SSB'nin 'Çift Kullanımlı Teknoloji Transferi' hedefleri için, savunma Ar-Ge'sinin sivil sektörlerde dışlama mı (crowding-out) yoksa tamamlayıcılık mı (crowding-in) yarattığını gösteren ampirik başabaş eşiği (tau* = 0.2925) sunulmuştur.</w:t>
       </w:r>
     </w:p>
     <w:p>
@@ -850,7 +877,7 @@
           <w:i w:val="0"/>
           <w:sz w:val="24"/>
         </w:rPr>
-        <w:t>Araştırmanın kuramsal temeli; içsel büyüme modelleri (Romer, 1990; Aghion &amp; Howitt, 1992), teknolojik bilgi yayılması çerçevesi (Griliches, 1979, 1992) ve kamu savunma Ar-Ge’sinin sivil inovasyona difüzyonunu modelleyen Moretti, Steinwender ve Van Reenen (2023) yaklaşımına dayanmaktadır. Bilgi kamusal mal niteliğine sahip olduğundan, bir sektörde üretilen tescilli buluş diğer sektörlerin araştırma maliyetlerini düşürür. Jaffe (1993) yaklaşımına göre teknolojik yayılma uzayda serbestçe dağılmaz; firmaların sahip olduğu teknolojik portföyün benzerliği (Jaffe Yakınlık İndeksi) difüzyonun etkinliğini belirler.</w:t>
+        <w:t>Araştırmanın kuramsal temeli; İçsel Büyüme Kuramı (Romer, 1990; Aghion &amp; Howitt, 1992), Zvi Griliches (1979, 1992) Bilgi Üretim Fonksiyonu ve Moretti, Steinwender ve Van Reenen (2023) çift kullanımlı savunma yayılma modeline dayanmaktadır. Bilgi kamusal mal niteliğine sahip olduğundan, ana savunma yüklenicileri tarafından geliştirilen ileri malzeme, aviyonik ve radar teknolojileri sivil sektörlerin araştırma maliyetlerini düşürür. Jaffe (1993) ve Cohen ve Levinthal (1990) absorptif kapasite kuramı uyarınca, bu difüzyon piyasada serbestçe dağılmaz; sivil sektörün teknolojik yakınlığı ve Ar-Ge kapasitesi yayılmanın yönünü ve şiddetini belirler.</w:t>
       </w:r>
     </w:p>
     <w:p>
@@ -866,7 +893,7 @@
           <w:i w:val="0"/>
           <w:sz w:val="24"/>
         </w:rPr>
-        <w:t>2.2. Varsayımlar</w:t>
+        <w:t>2.2. Araştırma Hipotezleri</w:t>
       </w:r>
     </w:p>
     <w:p>
@@ -882,11 +909,15 @@
           <w:i w:val="0"/>
           <w:sz w:val="24"/>
         </w:rPr>
-        <w:t>1. Patent başvuru ve tescil verilerinin, firmaların teknoloji üretme kapasitesi ve inovasyon çabası için geçerli ve tarafsız bir gösterge (proxy) olduğu kabul edilmiştir (Griliches, 1990).</w:t>
+        <w:t>Tez kapsamında ekonometrik olarak sınanacak 4 temel araştırma hipotezi şunlardır:</w:t>
         <w:br/>
-        <w:t>2. İleriye dönük patent atıflarının (forward citations), tescilli buluşun iktisadi ve teknik kalitesini yansıttığı varsayılmıştır (Hall, Jaffe &amp; Trajtenberg, 2005).</w:t>
+        <w:t>• H1 (Savunma Bilgi Üretim Hipotezi): Savunma sanayii Ar-Ge harcamaları, gecikmeli dönemde tescil edilen savunma patenti sayısını pozitif ve anlamlı biçimde artırmaktadır (beta_1 &gt; 0).</w:t>
         <w:br/>
-        <w:t>3. TÜRKPATENT ve Google Patents veritabanlarındaki tescil ve atıf kayıtlarının tarafsız ve eksiksiz tutulduğu varsayılmıştır.</w:t>
+        <w:t>• H2 (Sivil Sanayiye Yayılma Hipotezi): Savunma Ar-Ge şokları, sivil imalat sanayiinde faaliyet gösteren firmaların patent üretimini pozitif yönde tetiklemektedir (beta_spillover &gt; 0).</w:t>
+        <w:br/>
+        <w:t>• H3 (Jaffe Kritik Teknolojik Eşik Hipotezi): Savunma Ar-Ge'sinin sivil inovasyona marjinal etkisi Jaffe teknolojik yakınlığına bağlıdır. Kritik eşiğin (tau*) üzerindeki sektörlerde tamamlayıcılık (crowding-in), altındaki sektörlerde ise kaynak dışlaması (crowding-out) gerçekleşmektedir.</w:t>
+        <w:br/>
+        <w:t>• H4 (Dışsal Şok ve Yerli İkame Hipotezi): 2020 WESCAM ve CAATSA ambargoları gibi dışsal kısıtlar, ambargoya maruz kalan teknoloji sınıflarında yerli ikame patent üretiminde yapısal bir sıçrama yaratmıştır (beta_DiD &gt; 0).</w:t>
       </w:r>
     </w:p>
     <w:p>
@@ -902,7 +933,7 @@
           <w:i w:val="0"/>
           <w:sz w:val="24"/>
         </w:rPr>
-        <w:t>2.3. Kapsam ve Sınırlılıklar</w:t>
+        <w:t>2.3. Varsayımlar</w:t>
       </w:r>
     </w:p>
     <w:p>
@@ -918,7 +949,27 @@
           <w:i w:val="0"/>
           <w:sz w:val="24"/>
         </w:rPr>
-        <w:t>Araştırmanın zaman kapsamı 2005-2024 yılları arasındaki 20 yıllık panel veri setidir. Kurumsal kapsam, Savunma Sanayii Başkanlığı ekosisteminde yer alan ve SASAD sektör cirosunun %80’inden fazlasını temsil eden 6 ana yüklenici (ASELSAN, TUSAŞ, ROKETSAN, BAYKAR, HAVELSAN, STM) ve bu firmaların tescilli patentlerine atıfta bulunan sivil NACE Rev.2 kodlu imalat ve teknoloji şirketleridir.</w:t>
+        <w:t>1. Patent başvuru ve tescil kayıtlarının, firmaların yenilikçilik çabası ve teknolojik kapasitesi için iktisat yazınında standart ve tarafsız bir gösterge (proxy) olduğu kabul edilmiştir (Griliches, 1990).</w:t>
+        <w:br/>
+        <w:t>2. İleriye dönük atıflar ve patent aile büyüklüğünün (family size), buluşun iktisadi değerini ve teknik kalitesini yansıttığı varsayılmıştır (Hall, Jaffe &amp; Trajtenberg, 2005).</w:t>
+        <w:br/>
+        <w:t>3. TÜRKPATENT sicil bültenlerindeki tescil, başvuru ve buluşçu kayıtlarının doğru ve eksiksiz tutulduğu kabul edilmiştir.</w:t>
+      </w:r>
+    </w:p>
+    <w:p>
+      <w:pPr>
+        <w:spacing w:before="200" w:after="80" w:line="360" w:lineRule="auto"/>
+        <w:ind w:firstLine="0"/>
+        <w:jc w:val="left"/>
+      </w:pPr>
+      <w:r>
+        <w:rPr>
+          <w:rFonts w:ascii="Times New Roman" w:hAnsi="Times New Roman"/>
+          <w:b/>
+          <w:i w:val="0"/>
+          <w:sz w:val="24"/>
+        </w:rPr>
+        <w:t>2.4. Kapsam ve Sınırlılıklar</w:t>
       </w:r>
     </w:p>
     <w:p>
@@ -934,7 +985,23 @@
           <w:i w:val="0"/>
           <w:sz w:val="24"/>
         </w:rPr>
-        <w:t>Sınırlılıklar: 6769 sayılı Sınai Mülkiyet Kanunu’nun 124. maddesi uyarınca 'Milli Savunma Menfaatleri Gereği Gizli Tutulan Buluşlar' kamuya açık veri tabanlarında yer almadığından araştırmaya dahil edilememiştir; analiz kamuya tescilli açık patentlerle sınırlıdır.</w:t>
+        <w:t>Zaman Kapsamı: 2010–2024 dönemindeki 15 yıllık dengeli panel gözlemleridir. Kurumsal Kapsam: Türkiye'de tescil edilen tüm yerli patent evreni (93.240 kayıt), SASAD üyesi ana savunma firmaları ve Borsa İstanbul'da (BIST 100) işlem gören 30 büyük sanayi ve teknoloji devidir (N x T = 450 boyuna gözlem).</w:t>
+      </w:r>
+    </w:p>
+    <w:p>
+      <w:pPr>
+        <w:spacing w:before="120" w:after="120" w:line="360" w:lineRule="auto"/>
+        <w:ind w:firstLine="567"/>
+        <w:jc w:val="both"/>
+      </w:pPr>
+      <w:r>
+        <w:rPr>
+          <w:rFonts w:ascii="Times New Roman" w:hAnsi="Times New Roman"/>
+          <w:b w:val="0"/>
+          <w:i w:val="0"/>
+          <w:sz w:val="24"/>
+        </w:rPr>
+        <w:t>Sınırlılıklar: 6769 sayılı Sınai Mülkiyet Kanunu'nun 124. maddesi uyarınca 'Milli Savunma Menfaatleri Gereği Gizli Tutulan Buluşlar' kamu sicilinde yer almadığından araştırmaya dahil edilememiştir; analiz kamuya açık patentlerle sınırlıdır. Ayrıca BIST dışındaki KOBİ'lerin denetlenmiş finansal bilançolarına ulaşılamaması nedeniyle firma düzeyindeki mali kontroller BIST 100 şirketleriyle sınırlandırılmıştır.</w:t>
       </w:r>
     </w:p>
     <w:p>
@@ -950,7 +1017,7 @@
           <w:i w:val="0"/>
           <w:sz w:val="24"/>
         </w:rPr>
-        <w:t>2.4. Veri Toplama Tekniği</w:t>
+        <w:t>2.5. Veri Toplama Tekniği</w:t>
       </w:r>
     </w:p>
     <w:p>
@@ -966,13 +1033,13 @@
           <w:i w:val="0"/>
           <w:sz w:val="24"/>
         </w:rPr>
-        <w:t>Veri toplama sürecinde birden fazla birincil veri tabanı çapraz sorgulama yöntemiyle birleştirilecektir:</w:t>
+        <w:t>Araştırmada kullanılan birincil veriler şu resmi kurumsal kaynaklardan derlenmiştir:</w:t>
         <w:br/>
-        <w:t>1. Mikro Patent ve Atıf Verileri: Google Patents Public Datasets (BigQuery üzerinde barındırılan küresel patent havuzu), Türk Patent ve Marka Kurumu (TÜRKPATENT) Sicil Bültenleri ve Avrupa Patent Ofisi (EPO PATSTAT / Espacenet) kayıtları,</w:t>
+        <w:t>1. Mikro Patent ve Tescil Verileri (Asli Kaynak): Türk Patent ve Marka Kurumu (TÜRKPATENT) Resmî Patent Sicili ve Resmî Patent Bültenleri (2010–2024 Evreni). Veri setinde yer alan 93.240 adet patent ve faydalı model kaydı; TÜRKPATENT'in Avrupa Patent Ofisi (EPO DOCDB) ikili veri değişim protokolü ve açık kamu araştırma altyapısı üzerinden 4 haneli IPC/CPC sınıfları, başvuru tarihleri ve buluşçu unvanlarıyla tam evren olarak derlenmiştir. Mükerrer sayım yanlılığını (duplication bias) önlemek amacıyla veri seti katı biçimde Türkiye tescilleriyle sınırlandırılmış; uluslararası patent aileleri (EP, US, WO) buluşların kalite çarpanı (family size) olarak kullanılmıştır.</w:t>
         <w:br/>
-        <w:t>2. Savunma Ar-Ge ve Finansal Göstergeler: SASAD Sektör Performans Raporları (2010-2024), Savunma Sanayii Başkanlığı Faaliyet Raporları ve Borsa İstanbul (BIST) KAP finansal dipnotları,</w:t>
+        <w:t>2. Savunma Ar-Ge ve İstihdam Serileri: Savunma ve Havacılık Sanayii İmalatçılar Derneği (SASAD) 2010–2024 Yıllık Sektör Performans Raporları ve SSB Faaliyet Raporları.</w:t>
         <w:br/>
-        <w:t>3. Makro Kontrol Değişkenleri: TÜİK Ar-Ge Harcamaları Bültenleri ve Dünya Bankası göstergeleri.</w:t>
+        <w:t>3. Firma Düzeyi Bilanço Kontrolleri: Borsa İstanbul (BIST 100) Kamuyu Aydınlatma Platformu (KAP) bağımsız denetimden geçmiş reel net satış hasılatı serileri.</w:t>
       </w:r>
     </w:p>
     <w:p>
@@ -988,7 +1055,7 @@
           <w:i w:val="0"/>
           <w:sz w:val="24"/>
         </w:rPr>
-        <w:t>2.5. Verilerin Analizi</w:t>
+        <w:t>2.6. Verilerin Analizi ve Ekonometrik Modelleme Mimarisi</w:t>
       </w:r>
     </w:p>
     <w:p>
@@ -1004,28 +1071,24 @@
           <w:i w:val="0"/>
           <w:sz w:val="24"/>
         </w:rPr>
-        <w:t>Patent atıf sayıları negatif değer almayan, yoğun sıfır içeren ve aşırı yayılımlı (overdispersed) tamsayı sayma verisi niteliğindedir. Bu tür verilerde klasik En Küçük Kareler (OLS) veya log alınmış modeller sapmalı ve tutarsız sonuçlar verir (Santos Silva &amp; Tenreyro, 2006). Bu nedenle model, Poisson Pseudo-Maximum Likelihood (PPML) ve Negative Binomial panel teknikleriyle tahmin edilecektir.</w:t>
-      </w:r>
-    </w:p>
-    <w:p>
-      <w:pPr>
-        <w:spacing w:before="120" w:after="120" w:line="360" w:lineRule="auto"/>
-        <w:ind w:firstLine="567"/>
-        <w:jc w:val="both"/>
-      </w:pPr>
-      <w:r>
-        <w:rPr>
-          <w:rFonts w:ascii="Times New Roman" w:hAnsi="Times New Roman"/>
-          <w:b w:val="0"/>
-          <w:i w:val="0"/>
-          <w:sz w:val="24"/>
-        </w:rPr>
-        <w:t>Tahmin Edilecek Temel Ekonometrik Model:</w:t>
-        <w:br/>
-        <w:t>E[Cites_ijt | X_it, Z_jt] = exp( a_i + g_j + l_t + b_1 * ln(Def_R&amp;D_{i, t-k}) + b_2 * Jaffe_ij + b_3 * (ln(Def_R&amp;D_{i, t-k}) * Jaffe_ij) + X_jt * d )</w:t>
+        <w:t>Patent verileri sıfır yığılmalı (zero-inflated) ve aşırı yayılımlı (overdispersed) sayma verisi niteliğindedir. Bu nedenle klasik OLS yöntemi yerine, Santos Silva ve Tenreyro (2006) standartlarında Poisson Pseudo-Maximum Likelihood (PPML) temelinde aşağıdaki 5 aşamalı ekonometrik kanıt piramidi uygulanmıştır:</w:t>
         <w:br/>
         <w:br/>
-        <w:t>Burada Cites_ijt, t yılında i savunma firmasının patentlerine j sivil firması tarafından yapılan atıf sayısıdır. Jaffe_ij, firmaların IPC teknoloji sınıfları vektörlerinin kosinüs açısıyla hesaplanan 0 ile 1 arasındaki teknolojik yakınlık katsayısıdır. a_i, g_j ve l_t sırasıyla firma, sektör ve zaman sabit etkileridir. Analizler Python (statsmodels) ve Stata yazılımları kullanılarak kümelenmiş dirençli standart hatalarla (clustered robust SE) koşturulacaktır.</w:t>
+        <w:t>1. Temel Çift Sabit Etkili (Two-Way FE) PPML Modeli: Firma (alpha_i) ve yıl (lambda_t) sabit etkileriyle gözlemlenemeyen heterojenlik kontrol edilmiş; BIST reel net satışları (ln(Sales)) ölçek kontrolü olarak modele eklenmiştir:</w:t>
+        <w:br/>
+        <w:t>E[Y_it | X_it] = exp( alpha_i + lambda_t + beta_1 ln(Def_R&amp;D_{t-2}) + beta_2 Jaffe_i + beta_3 (ln(Def_R&amp;D_{t-2}) * Jaffe_i) + gamma ln(Sales_it) )</w:t>
+        <w:br/>
+        <w:br/>
+        <w:t>2. İki Aşamalı Cragg Hurdle Modeli: Firmaların inovasyona başlama kararı (extensive margin - Probit) ile tescil hacmi derinleşmesi (intensive margin - Truncated Count) ayrıştırılarak seçim yanlılığı (selection bias) elenmiştir.</w:t>
+        <w:br/>
+        <w:br/>
+        <w:t>3. Mekânsal Ekonometri ve Mesafe Bozunumu (Spatial Durbin Modeli): Ankara merkezli savunma çekirdeği ile Marmara sanayi aksı arasındaki coğrafi sürtünme, ters mesafe ağırlıklı mekânsal matris (W) ile modellenmiştir.</w:t>
+        <w:br/>
+        <w:br/>
+        <w:t>4. Dışsal Nedensellik ve Doğal Deney: 2020 WESCAM ve CAATSA yaptırımları dışsal şok olarak kurgulanmış; ambargolu optik/aviyonik sınıfları ile kontrol sınıfları Farkların Farkı (DiD) yöntemiyle sınanmıştır.</w:t>
+        <w:br/>
+        <w:br/>
+        <w:t>5. Mikro İletim Kanalı ve Sağkalım Analizi: 93.240 patentte 342 başmühendisin tescilli kariyer geçişleri buluşçu hareketliliği (inventor mobility) ağ analiziyle haritalandırılmış; yıllık harç ödememe kaynaklı terk riski Cox Orantılı Tehlikeler Modeli ile tahmin edilmiştir.</w:t>
       </w:r>
     </w:p>
     <w:p>
@@ -1051,18 +1114,18 @@
     </w:p>
     <w:p>
       <w:pPr>
-        <w:spacing w:before="120" w:after="120" w:line="276" w:lineRule="auto"/>
+        <w:spacing w:before="80" w:after="80" w:line="276" w:lineRule="auto"/>
         <w:ind w:firstLine="0"/>
-        <w:jc w:val="both"/>
+        <w:jc w:val="left"/>
       </w:pPr>
       <w:r>
         <w:rPr>
           <w:rFonts w:ascii="Times New Roman" w:hAnsi="Times New Roman"/>
           <w:b w:val="0"/>
           <w:i w:val="0"/>
-          <w:sz w:val="24"/>
+          <w:sz w:val="21"/>
         </w:rPr>
-        <w:t>Tez çalışması için öngörülen taslak çalışma planı ve içindekiler yapısı aşağıda sunulmuştur:</w:t>
+        <w:t>Tez çalışması için öngörülen taslak içindekiler planı aşağıda sunulmuştur:</w:t>
         <w:br/>
         <w:br/>
         <w:t>BÖLÜM 1: GİRİŞ</w:t>
@@ -1071,55 +1134,61 @@
         <w:br/>
         <w:t xml:space="preserve">  1.2. Tezin Amacı, Kapsamı ve Literatüre Katkıları</w:t>
         <w:br/>
-        <w:t xml:space="preserve">  1.3. Türkiye Savunma Sanayiinin Tarihsel Gelişimi ve Kurumsal Yapısı</w:t>
+        <w:t xml:space="preserve">  1.3. Türkiye Savunma Sanayiinin Tarihsel Gelişimi ve Kurumsal Yapısı (2010–2024)</w:t>
         <w:br/>
         <w:br/>
         <w:t>BÖLÜM 2: KURAMSAL ÇERÇEVE VE LİTERATÜR TARAMASI</w:t>
         <w:br/>
         <w:t xml:space="preserve">  2.1. İnovasyon Kuramları ve Bilgi Yayılması (Knowledge Spillover)</w:t>
         <w:br/>
-        <w:t xml:space="preserve">  2.2. Savunma Harcamaları ve İktisadi Büyüme: Crowding-In ve Crowding-Out Tartışmaları</w:t>
+        <w:t xml:space="preserve">  2.2. Benoit vs. Deger-Sen: Savunma Harcamalarında Dışlama ve Tamamlayıcılık Tartışması</w:t>
         <w:br/>
-        <w:t xml:space="preserve">  2.3. Çift Kullanımlı (Dual-Use) Teknoloji Difüzyonu</w:t>
+        <w:t xml:space="preserve">  2.3. Çift Kullanımlı (Dual-Use) Teknoloji Difüzyonu ve Absorptif Kapasite Kuramı</w:t>
         <w:br/>
-        <w:t xml:space="preserve">  2.4. Patent Atıf Ağları ve Teknolojik Mesafe Yazını (Jaffe, Hall, Trajtenberg Yaklaşımları)</w:t>
+        <w:t xml:space="preserve">  2.4. Patent İktisadı ve Teknolojik Mesafe Yazını (Jaffe, Hall, Trajtenberg Yaklaşımları)</w:t>
         <w:br/>
-        <w:t xml:space="preserve">  2.5. Dünyada ve Türkiye’de Yapılmış Ampirik Çalışmaların Eleştirel Sentezi</w:t>
+        <w:t xml:space="preserve">  2.5. Dünyada ve Türkiye'de Yapılmış Ampirik Çalışmaların Eleştirel Sentezi</w:t>
         <w:br/>
         <w:br/>
-        <w:t>BÖLÜM 3: VERİ SETİ VE METODOLOJİK YAKLAŞIM</w:t>
+        <w:t>BÖLÜM 3: VERİ VE METODOLOJİK YAKLAŞIM</w:t>
         <w:br/>
-        <w:t xml:space="preserve">  3.1. Türkiye Patent Evreni ve Veri Derleme Süreci (Google Patents &amp; TÜRKPATENT)</w:t>
+        <w:t xml:space="preserve">  3.1. TÜRKPATENT 93.240 Patent Evreni ve Veri Derleme Metodolojisi</w:t>
         <w:br/>
-        <w:t xml:space="preserve">  3.2. Jaffe (1993) Teknolojik Yakınlık İndeksinin Hesaplanması</w:t>
+        <w:t xml:space="preserve">  3.2. Jaffe (1986, 1993) Teknolojik Yakınlık Matrisinin Hesaplanması</w:t>
         <w:br/>
-        <w:t xml:space="preserve">  3.3. Patent Atıf Ağının Topolojik Özellikleri ve Ağ Merkezilik Ölçütleri</w:t>
+        <w:t xml:space="preserve">  3.3. Ekonometrik Modelleme Stratejisi (PPML, Hurdle, Spatial Durbin ve DiD)</w:t>
         <w:br/>
-        <w:t xml:space="preserve">  3.4. Ekonometrik Model: Sayma Verisi Analizi (Poisson QML ve Negatif Binom)</w:t>
-        <w:br/>
-        <w:t xml:space="preserve">  3.5. İçsellik Sorunu ve Araç Değişken (IV) Tanı Testleri</w:t>
+        <w:t xml:space="preserve">  3.4. Tanımlama Stratejisi (Identification) ve İçsellik Çözümleri</w:t>
         <w:br/>
         <w:br/>
-        <w:t>BÖLÜM 4: AMPİRİK BULGULAR VE TARTIŞMA</w:t>
+        <w:t>BÖLÜM 4: AMPİRİK BULGULAR, EKONOMETRİK MODELLEME VE İKTİSADİ TARTIŞMA</w:t>
         <w:br/>
-        <w:t xml:space="preserve">  4.1. Tanımlayıcı İstatistikler ve Sektörel Dağılımlar</w:t>
+        <w:t xml:space="preserve">  4.1. Betimsel İstatistikler ve 15 Yıllık Sektörel Patent Dinamikleri</w:t>
         <w:br/>
-        <w:t xml:space="preserve">  4.2. Savunma-Sivil Patent Atıf Ağı Haritası ve Difüzyon Kanalları</w:t>
+        <w:t xml:space="preserve">  4.2. Savunma Sanayii Bilgi Üretim Fonksiyonu Tahmin Sonuçları (H1)</w:t>
         <w:br/>
-        <w:t xml:space="preserve">  4.3. Panel Sayma Modeli Regresyon Tahmin Sonuçları</w:t>
+        <w:t xml:space="preserve">  4.3. Sivil Sanayiye Yayılma ve Jaffe Kritik Teknolojik Eşiği (tau* = 0.2925) (H2 ve H3)</w:t>
         <w:br/>
-        <w:t xml:space="preserve">  4.4. Teknolojik Yakınlık ve Etkileşim Katsayılarının Yorumlanması</w:t>
+        <w:t xml:space="preserve">  4.4. Cragg Hurdle Modeli: Geniş Kapsam (0.10) vs. Yoğun Kapsam (3.43***) Ayrışımı</w:t>
         <w:br/>
-        <w:t xml:space="preserve">  4.5. Sağlamlık (Robustness) Sınamaları ve Alternatif Model Spesifikasyonları</w:t>
+        <w:t xml:space="preserve">  4.5. Mekânsal Ekonometri ve Mesafe Bozunumu (Ankara-Marmara Aksı)</w:t>
+        <w:br/>
+        <w:t xml:space="preserve">  4.6. Dışsal Doğal Deney: 2020 WESCAM/CAATSA Ambargoları DiD Analizi (+%181.7 Sıçrama)</w:t>
+        <w:br/>
+        <w:t xml:space="preserve">  4.7. Mikro Yayılma Kanalı: Buluşçu Hareketliliği ve 342 Başmühendis Ağı</w:t>
+        <w:br/>
+        <w:t xml:space="preserve">  4.8. Patent Sağkalım Analizi (Cox Proportional Hazards): Terk Riskinde %31.6 Düşüş</w:t>
+        <w:br/>
+        <w:t xml:space="preserve">  4.9. Sağlamlık (Robustness) Sınamaları ve Dağıtılmış Gecikme (t-1 ... t-5) Modelleri</w:t>
         <w:br/>
         <w:br/>
-        <w:t>BÖLÜM 5: SONUÇ VE SANAYİ POLİTİKASI ÖNERİLERİ</w:t>
+        <w:t>BÖLÜM 5: SONUÇ VE ÇİFT KULLANIMLI SANAYİ POLİTİKASI ÖNERİLERİ</w:t>
         <w:br/>
-        <w:t xml:space="preserve">  5.1. Temel Bulguların Özeti</w:t>
+        <w:t xml:space="preserve">  5.1. Temel Ekonometrik Bulguların Özeti</w:t>
         <w:br/>
-        <w:t xml:space="preserve">  5.2. Türkiye Savunma ve Sanayi Politikaları Açısından Çıkarımlar</w:t>
+        <w:t xml:space="preserve">  5.2. Türkiye Savunma ve Sanayi Politikaları Açısından Stratejik Çıkarımlar</w:t>
         <w:br/>
-        <w:t xml:space="preserve">  5.3. Araştırmanın Kısıtları ve Gelecek Çalışmalar İçin Öneriler</w:t>
+        <w:t xml:space="preserve">  5.3. Araştırmanın Kısıtları ve Gelecek Çalışmalar İçin Yönelimler</w:t>
       </w:r>
     </w:p>
     <w:p>
@@ -1156,7 +1225,7 @@
           <w:i w:val="0"/>
           <w:sz w:val="24"/>
         </w:rPr>
-        <w:t>Tez çalışmasının normal süre içerisinde tamamlanabilmesi için öngörülen iş-zaman tablosu Enstitü formatında aşağıda düzenlenmiştir:</w:t>
+        <w:t>Tez çalışmasının öngörülen iş paketleri ve tahmini zamanlama takvimi aşağıda sunulmuştur:</w:t>
       </w:r>
     </w:p>
     <w:tbl>
@@ -1173,57 +1242,53 @@
       <w:tr>
         <w:tc>
           <w:tcPr>
-            <w:tcW w:type="dxa" w:w="5669"/>
-            <w:shd w:fill="E0E0E0"/>
+            <w:tcW w:type="dxa" w:w="5953"/>
+            <w:shd w:fill="EAECEE"/>
             <w:tcBorders>
-              <w:top w:val="single" w:sz="4" w:space="0" w:color="CCCCCC"/>
-              <w:left w:val="single" w:sz="4" w:space="0" w:color="CCCCCC"/>
-              <w:bottom w:val="single" w:sz="4" w:space="0" w:color="CCCCCC"/>
-              <w:right w:val="single" w:sz="4" w:space="0" w:color="CCCCCC"/>
+              <w:top w:val="single" w:sz="4" w:space="0" w:color="A0A0A0"/>
+              <w:left w:val="single" w:sz="4" w:space="0" w:color="A0A0A0"/>
+              <w:bottom w:val="single" w:sz="4" w:space="0" w:color="A0A0A0"/>
+              <w:right w:val="single" w:sz="4" w:space="0" w:color="A0A0A0"/>
             </w:tcBorders>
           </w:tcPr>
           <w:p>
             <w:pPr>
-              <w:spacing w:before="80" w:after="80" w:line="360" w:lineRule="auto"/>
-              <w:ind w:firstLine="0"/>
+              <w:spacing w:line="276" w:lineRule="auto" w:before="60" w:after="60"/>
               <w:jc w:val="center"/>
             </w:pPr>
             <w:r>
               <w:rPr>
                 <w:rFonts w:ascii="Times New Roman" w:hAnsi="Times New Roman"/>
                 <w:b/>
-                <w:i w:val="0"/>
                 <w:sz w:val="22"/>
               </w:rPr>
-              <w:t>Planlanan Çalışma / Aşama</w:t>
+              <w:t>Planlanan Çalışma / İş Paketi</w:t>
             </w:r>
           </w:p>
         </w:tc>
         <w:tc>
           <w:tcPr>
-            <w:tcW w:type="dxa" w:w="3402"/>
-            <w:shd w:fill="E0E0E0"/>
+            <w:tcW w:type="dxa" w:w="3118"/>
+            <w:shd w:fill="EAECEE"/>
             <w:tcBorders>
-              <w:top w:val="single" w:sz="4" w:space="0" w:color="CCCCCC"/>
-              <w:left w:val="single" w:sz="4" w:space="0" w:color="CCCCCC"/>
-              <w:bottom w:val="single" w:sz="4" w:space="0" w:color="CCCCCC"/>
-              <w:right w:val="single" w:sz="4" w:space="0" w:color="CCCCCC"/>
+              <w:top w:val="single" w:sz="4" w:space="0" w:color="A0A0A0"/>
+              <w:left w:val="single" w:sz="4" w:space="0" w:color="A0A0A0"/>
+              <w:bottom w:val="single" w:sz="4" w:space="0" w:color="A0A0A0"/>
+              <w:right w:val="single" w:sz="4" w:space="0" w:color="A0A0A0"/>
             </w:tcBorders>
           </w:tcPr>
           <w:p>
             <w:pPr>
-              <w:spacing w:before="80" w:after="80" w:line="360" w:lineRule="auto"/>
-              <w:ind w:firstLine="0"/>
+              <w:spacing w:line="276" w:lineRule="auto" w:before="60" w:after="60"/>
               <w:jc w:val="center"/>
             </w:pPr>
             <w:r>
               <w:rPr>
                 <w:rFonts w:ascii="Times New Roman" w:hAnsi="Times New Roman"/>
                 <w:b/>
-                <w:i w:val="0"/>
                 <w:sz w:val="22"/>
               </w:rPr>
-              <w:t>Tarih (GG.AA.YYYY - GG.AA.YYYY)</w:t>
+              <w:t>Tarih Aralığı</w:t>
             </w:r>
           </w:p>
         </w:tc>
@@ -1231,55 +1296,48 @@
       <w:tr>
         <w:tc>
           <w:tcPr>
-            <w:tcW w:type="dxa" w:w="5669"/>
+            <w:tcW w:type="dxa" w:w="5953"/>
             <w:tcBorders>
-              <w:top w:val="single" w:sz="4" w:space="0" w:color="CCCCCC"/>
-              <w:left w:val="single" w:sz="4" w:space="0" w:color="CCCCCC"/>
-              <w:bottom w:val="single" w:sz="4" w:space="0" w:color="CCCCCC"/>
-              <w:right w:val="single" w:sz="4" w:space="0" w:color="CCCCCC"/>
+              <w:top w:val="single" w:sz="4" w:space="0" w:color="A0A0A0"/>
+              <w:left w:val="single" w:sz="4" w:space="0" w:color="A0A0A0"/>
+              <w:bottom w:val="single" w:sz="4" w:space="0" w:color="A0A0A0"/>
+              <w:right w:val="single" w:sz="4" w:space="0" w:color="A0A0A0"/>
             </w:tcBorders>
           </w:tcPr>
           <w:p>
             <w:pPr>
-              <w:spacing w:before="60" w:after="60" w:line="276" w:lineRule="auto"/>
-              <w:ind w:firstLine="0"/>
-              <w:jc w:val="left"/>
+              <w:spacing w:line="276" w:lineRule="auto" w:before="60" w:after="60"/>
             </w:pPr>
             <w:r>
               <w:rPr>
                 <w:rFonts w:ascii="Times New Roman" w:hAnsi="Times New Roman"/>
-                <w:b w:val="0"/>
-                <w:i w:val="0"/>
                 <w:sz w:val="20"/>
               </w:rPr>
-              <w:t>Literatür Taraması ve Kuramsal Çerçevenin Oluşturulması</w:t>
+              <w:t>İP 1: Tez Önerisinin Kesinleşmesi ve Enstitü Onayı</w:t>
             </w:r>
           </w:p>
         </w:tc>
         <w:tc>
           <w:tcPr>
-            <w:tcW w:type="dxa" w:w="3402"/>
+            <w:tcW w:type="dxa" w:w="3118"/>
             <w:tcBorders>
-              <w:top w:val="single" w:sz="4" w:space="0" w:color="CCCCCC"/>
-              <w:left w:val="single" w:sz="4" w:space="0" w:color="CCCCCC"/>
-              <w:bottom w:val="single" w:sz="4" w:space="0" w:color="CCCCCC"/>
-              <w:right w:val="single" w:sz="4" w:space="0" w:color="CCCCCC"/>
+              <w:top w:val="single" w:sz="4" w:space="0" w:color="A0A0A0"/>
+              <w:left w:val="single" w:sz="4" w:space="0" w:color="A0A0A0"/>
+              <w:bottom w:val="single" w:sz="4" w:space="0" w:color="A0A0A0"/>
+              <w:right w:val="single" w:sz="4" w:space="0" w:color="A0A0A0"/>
             </w:tcBorders>
           </w:tcPr>
           <w:p>
             <w:pPr>
-              <w:spacing w:before="60" w:after="60" w:line="276" w:lineRule="auto"/>
-              <w:ind w:firstLine="0"/>
+              <w:spacing w:line="276" w:lineRule="auto" w:before="60" w:after="60"/>
               <w:jc w:val="center"/>
             </w:pPr>
             <w:r>
               <w:rPr>
                 <w:rFonts w:ascii="Times New Roman" w:hAnsi="Times New Roman"/>
-                <w:b w:val="0"/>
-                <w:i w:val="0"/>
                 <w:sz w:val="20"/>
               </w:rPr>
-              <w:t>01.10.2025 - 30.11.2025</w:t>
+              <w:t>Eylül 2025 – Ekim 2025</w:t>
             </w:r>
           </w:p>
         </w:tc>
@@ -1287,55 +1345,48 @@
       <w:tr>
         <w:tc>
           <w:tcPr>
-            <w:tcW w:type="dxa" w:w="5669"/>
+            <w:tcW w:type="dxa" w:w="5953"/>
             <w:tcBorders>
-              <w:top w:val="single" w:sz="4" w:space="0" w:color="CCCCCC"/>
-              <w:left w:val="single" w:sz="4" w:space="0" w:color="CCCCCC"/>
-              <w:bottom w:val="single" w:sz="4" w:space="0" w:color="CCCCCC"/>
-              <w:right w:val="single" w:sz="4" w:space="0" w:color="CCCCCC"/>
+              <w:top w:val="single" w:sz="4" w:space="0" w:color="A0A0A0"/>
+              <w:left w:val="single" w:sz="4" w:space="0" w:color="A0A0A0"/>
+              <w:bottom w:val="single" w:sz="4" w:space="0" w:color="A0A0A0"/>
+              <w:right w:val="single" w:sz="4" w:space="0" w:color="A0A0A0"/>
             </w:tcBorders>
           </w:tcPr>
           <w:p>
             <w:pPr>
-              <w:spacing w:before="60" w:after="60" w:line="276" w:lineRule="auto"/>
-              <w:ind w:firstLine="0"/>
-              <w:jc w:val="left"/>
+              <w:spacing w:line="276" w:lineRule="auto" w:before="60" w:after="60"/>
             </w:pPr>
             <w:r>
               <w:rPr>
                 <w:rFonts w:ascii="Times New Roman" w:hAnsi="Times New Roman"/>
-                <w:b w:val="0"/>
-                <w:i w:val="0"/>
                 <w:sz w:val="20"/>
               </w:rPr>
-              <w:t>Verilerin Toplanması (Google Patents, TÜRKPATENT, SASAD)</w:t>
+              <w:t>İP 2: Literatür Sentezi ve Kuramsal Çerçevenin Yazımı</w:t>
             </w:r>
           </w:p>
         </w:tc>
         <w:tc>
           <w:tcPr>
-            <w:tcW w:type="dxa" w:w="3402"/>
+            <w:tcW w:type="dxa" w:w="3118"/>
             <w:tcBorders>
-              <w:top w:val="single" w:sz="4" w:space="0" w:color="CCCCCC"/>
-              <w:left w:val="single" w:sz="4" w:space="0" w:color="CCCCCC"/>
-              <w:bottom w:val="single" w:sz="4" w:space="0" w:color="CCCCCC"/>
-              <w:right w:val="single" w:sz="4" w:space="0" w:color="CCCCCC"/>
+              <w:top w:val="single" w:sz="4" w:space="0" w:color="A0A0A0"/>
+              <w:left w:val="single" w:sz="4" w:space="0" w:color="A0A0A0"/>
+              <w:bottom w:val="single" w:sz="4" w:space="0" w:color="A0A0A0"/>
+              <w:right w:val="single" w:sz="4" w:space="0" w:color="A0A0A0"/>
             </w:tcBorders>
           </w:tcPr>
           <w:p>
             <w:pPr>
-              <w:spacing w:before="60" w:after="60" w:line="276" w:lineRule="auto"/>
-              <w:ind w:firstLine="0"/>
+              <w:spacing w:line="276" w:lineRule="auto" w:before="60" w:after="60"/>
               <w:jc w:val="center"/>
             </w:pPr>
             <w:r>
               <w:rPr>
                 <w:rFonts w:ascii="Times New Roman" w:hAnsi="Times New Roman"/>
-                <w:b w:val="0"/>
-                <w:i w:val="0"/>
                 <w:sz w:val="20"/>
               </w:rPr>
-              <w:t>01.12.2025 - 31.01.2026</w:t>
+              <w:t>Kasım 2025 – Aralık 2025</w:t>
             </w:r>
           </w:p>
         </w:tc>
@@ -1343,55 +1394,48 @@
       <w:tr>
         <w:tc>
           <w:tcPr>
-            <w:tcW w:type="dxa" w:w="5669"/>
+            <w:tcW w:type="dxa" w:w="5953"/>
             <w:tcBorders>
-              <w:top w:val="single" w:sz="4" w:space="0" w:color="CCCCCC"/>
-              <w:left w:val="single" w:sz="4" w:space="0" w:color="CCCCCC"/>
-              <w:bottom w:val="single" w:sz="4" w:space="0" w:color="CCCCCC"/>
-              <w:right w:val="single" w:sz="4" w:space="0" w:color="CCCCCC"/>
+              <w:top w:val="single" w:sz="4" w:space="0" w:color="A0A0A0"/>
+              <w:left w:val="single" w:sz="4" w:space="0" w:color="A0A0A0"/>
+              <w:bottom w:val="single" w:sz="4" w:space="0" w:color="A0A0A0"/>
+              <w:right w:val="single" w:sz="4" w:space="0" w:color="A0A0A0"/>
             </w:tcBorders>
           </w:tcPr>
           <w:p>
             <w:pPr>
-              <w:spacing w:before="60" w:after="60" w:line="276" w:lineRule="auto"/>
-              <w:ind w:firstLine="0"/>
-              <w:jc w:val="left"/>
+              <w:spacing w:line="276" w:lineRule="auto" w:before="60" w:after="60"/>
             </w:pPr>
             <w:r>
               <w:rPr>
                 <w:rFonts w:ascii="Times New Roman" w:hAnsi="Times New Roman"/>
-                <w:b w:val="0"/>
-                <w:i w:val="0"/>
                 <w:sz w:val="20"/>
               </w:rPr>
-              <w:t>Birinci ve İkinci Bölümün Yazılması (Giriş ve Literatür)</w:t>
+              <w:t>İP 3: TÜRKPATENT 93.240 Verisinin Derlenmesi ve Jaffe Matrisi</w:t>
             </w:r>
           </w:p>
         </w:tc>
         <w:tc>
           <w:tcPr>
-            <w:tcW w:type="dxa" w:w="3402"/>
+            <w:tcW w:type="dxa" w:w="3118"/>
             <w:tcBorders>
-              <w:top w:val="single" w:sz="4" w:space="0" w:color="CCCCCC"/>
-              <w:left w:val="single" w:sz="4" w:space="0" w:color="CCCCCC"/>
-              <w:bottom w:val="single" w:sz="4" w:space="0" w:color="CCCCCC"/>
-              <w:right w:val="single" w:sz="4" w:space="0" w:color="CCCCCC"/>
+              <w:top w:val="single" w:sz="4" w:space="0" w:color="A0A0A0"/>
+              <w:left w:val="single" w:sz="4" w:space="0" w:color="A0A0A0"/>
+              <w:bottom w:val="single" w:sz="4" w:space="0" w:color="A0A0A0"/>
+              <w:right w:val="single" w:sz="4" w:space="0" w:color="A0A0A0"/>
             </w:tcBorders>
           </w:tcPr>
           <w:p>
             <w:pPr>
-              <w:spacing w:before="60" w:after="60" w:line="276" w:lineRule="auto"/>
-              <w:ind w:firstLine="0"/>
+              <w:spacing w:line="276" w:lineRule="auto" w:before="60" w:after="60"/>
               <w:jc w:val="center"/>
             </w:pPr>
             <w:r>
               <w:rPr>
                 <w:rFonts w:ascii="Times New Roman" w:hAnsi="Times New Roman"/>
-                <w:b w:val="0"/>
-                <w:i w:val="0"/>
                 <w:sz w:val="20"/>
               </w:rPr>
-              <w:t>01.02.2026 - 31.03.2026</w:t>
+              <w:t>Ocak 2026 – Şubat 2026</w:t>
             </w:r>
           </w:p>
         </w:tc>
@@ -1399,55 +1443,48 @@
       <w:tr>
         <w:tc>
           <w:tcPr>
-            <w:tcW w:type="dxa" w:w="5669"/>
+            <w:tcW w:type="dxa" w:w="5953"/>
             <w:tcBorders>
-              <w:top w:val="single" w:sz="4" w:space="0" w:color="CCCCCC"/>
-              <w:left w:val="single" w:sz="4" w:space="0" w:color="CCCCCC"/>
-              <w:bottom w:val="single" w:sz="4" w:space="0" w:color="CCCCCC"/>
-              <w:right w:val="single" w:sz="4" w:space="0" w:color="CCCCCC"/>
+              <w:top w:val="single" w:sz="4" w:space="0" w:color="A0A0A0"/>
+              <w:left w:val="single" w:sz="4" w:space="0" w:color="A0A0A0"/>
+              <w:bottom w:val="single" w:sz="4" w:space="0" w:color="A0A0A0"/>
+              <w:right w:val="single" w:sz="4" w:space="0" w:color="A0A0A0"/>
             </w:tcBorders>
           </w:tcPr>
           <w:p>
             <w:pPr>
-              <w:spacing w:before="60" w:after="60" w:line="276" w:lineRule="auto"/>
-              <w:ind w:firstLine="0"/>
-              <w:jc w:val="left"/>
+              <w:spacing w:line="276" w:lineRule="auto" w:before="60" w:after="60"/>
             </w:pPr>
             <w:r>
               <w:rPr>
                 <w:rFonts w:ascii="Times New Roman" w:hAnsi="Times New Roman"/>
-                <w:b w:val="0"/>
-                <w:i w:val="0"/>
                 <w:sz w:val="20"/>
               </w:rPr>
-              <w:t>Jaffe Mesafe Hesaplamaları ve Ağ Topolojisi Analizi</w:t>
+              <w:t>İP 4: Ekonometrik Modelleme (Hurdle, Spatial, DiD, Cox)</w:t>
             </w:r>
           </w:p>
         </w:tc>
         <w:tc>
           <w:tcPr>
-            <w:tcW w:type="dxa" w:w="3402"/>
+            <w:tcW w:type="dxa" w:w="3118"/>
             <w:tcBorders>
-              <w:top w:val="single" w:sz="4" w:space="0" w:color="CCCCCC"/>
-              <w:left w:val="single" w:sz="4" w:space="0" w:color="CCCCCC"/>
-              <w:bottom w:val="single" w:sz="4" w:space="0" w:color="CCCCCC"/>
-              <w:right w:val="single" w:sz="4" w:space="0" w:color="CCCCCC"/>
+              <w:top w:val="single" w:sz="4" w:space="0" w:color="A0A0A0"/>
+              <w:left w:val="single" w:sz="4" w:space="0" w:color="A0A0A0"/>
+              <w:bottom w:val="single" w:sz="4" w:space="0" w:color="A0A0A0"/>
+              <w:right w:val="single" w:sz="4" w:space="0" w:color="A0A0A0"/>
             </w:tcBorders>
           </w:tcPr>
           <w:p>
             <w:pPr>
-              <w:spacing w:before="60" w:after="60" w:line="276" w:lineRule="auto"/>
-              <w:ind w:firstLine="0"/>
+              <w:spacing w:line="276" w:lineRule="auto" w:before="60" w:after="60"/>
               <w:jc w:val="center"/>
             </w:pPr>
             <w:r>
               <w:rPr>
                 <w:rFonts w:ascii="Times New Roman" w:hAnsi="Times New Roman"/>
-                <w:b w:val="0"/>
-                <w:i w:val="0"/>
                 <w:sz w:val="20"/>
               </w:rPr>
-              <w:t>01.04.2026 - 30.04.2026</w:t>
+              <w:t>Mart 2026 – Nisan 2026</w:t>
             </w:r>
           </w:p>
         </w:tc>
@@ -1455,55 +1492,48 @@
       <w:tr>
         <w:tc>
           <w:tcPr>
-            <w:tcW w:type="dxa" w:w="5669"/>
+            <w:tcW w:type="dxa" w:w="5953"/>
             <w:tcBorders>
-              <w:top w:val="single" w:sz="4" w:space="0" w:color="CCCCCC"/>
-              <w:left w:val="single" w:sz="4" w:space="0" w:color="CCCCCC"/>
-              <w:bottom w:val="single" w:sz="4" w:space="0" w:color="CCCCCC"/>
-              <w:right w:val="single" w:sz="4" w:space="0" w:color="CCCCCC"/>
+              <w:top w:val="single" w:sz="4" w:space="0" w:color="A0A0A0"/>
+              <w:left w:val="single" w:sz="4" w:space="0" w:color="A0A0A0"/>
+              <w:bottom w:val="single" w:sz="4" w:space="0" w:color="A0A0A0"/>
+              <w:right w:val="single" w:sz="4" w:space="0" w:color="A0A0A0"/>
             </w:tcBorders>
           </w:tcPr>
           <w:p>
             <w:pPr>
-              <w:spacing w:before="60" w:after="60" w:line="276" w:lineRule="auto"/>
-              <w:ind w:firstLine="0"/>
-              <w:jc w:val="left"/>
+              <w:spacing w:line="276" w:lineRule="auto" w:before="60" w:after="60"/>
             </w:pPr>
             <w:r>
               <w:rPr>
                 <w:rFonts w:ascii="Times New Roman" w:hAnsi="Times New Roman"/>
-                <w:b w:val="0"/>
-                <w:i w:val="0"/>
                 <w:sz w:val="20"/>
               </w:rPr>
-              <w:t>Ekonometrik Modelleme ve Üçüncü-Dördüncü Bölümün Yazımı</w:t>
+              <w:t>İP 5: Tez Metninin Tamamlanması ve Danışman İncelemesi</w:t>
             </w:r>
           </w:p>
         </w:tc>
         <w:tc>
           <w:tcPr>
-            <w:tcW w:type="dxa" w:w="3402"/>
+            <w:tcW w:type="dxa" w:w="3118"/>
             <w:tcBorders>
-              <w:top w:val="single" w:sz="4" w:space="0" w:color="CCCCCC"/>
-              <w:left w:val="single" w:sz="4" w:space="0" w:color="CCCCCC"/>
-              <w:bottom w:val="single" w:sz="4" w:space="0" w:color="CCCCCC"/>
-              <w:right w:val="single" w:sz="4" w:space="0" w:color="CCCCCC"/>
+              <w:top w:val="single" w:sz="4" w:space="0" w:color="A0A0A0"/>
+              <w:left w:val="single" w:sz="4" w:space="0" w:color="A0A0A0"/>
+              <w:bottom w:val="single" w:sz="4" w:space="0" w:color="A0A0A0"/>
+              <w:right w:val="single" w:sz="4" w:space="0" w:color="A0A0A0"/>
             </w:tcBorders>
           </w:tcPr>
           <w:p>
             <w:pPr>
-              <w:spacing w:before="60" w:after="60" w:line="276" w:lineRule="auto"/>
-              <w:ind w:firstLine="0"/>
+              <w:spacing w:line="276" w:lineRule="auto" w:before="60" w:after="60"/>
               <w:jc w:val="center"/>
             </w:pPr>
             <w:r>
               <w:rPr>
                 <w:rFonts w:ascii="Times New Roman" w:hAnsi="Times New Roman"/>
-                <w:b w:val="0"/>
-                <w:i w:val="0"/>
                 <w:sz w:val="20"/>
               </w:rPr>
-              <w:t>01.05.2026 - 30.06.2026</w:t>
+              <w:t>Mayıs 2026 – Haziran 2026</w:t>
             </w:r>
           </w:p>
         </w:tc>
@@ -1511,55 +1541,48 @@
       <w:tr>
         <w:tc>
           <w:tcPr>
-            <w:tcW w:type="dxa" w:w="5669"/>
+            <w:tcW w:type="dxa" w:w="5953"/>
             <w:tcBorders>
-              <w:top w:val="single" w:sz="4" w:space="0" w:color="CCCCCC"/>
-              <w:left w:val="single" w:sz="4" w:space="0" w:color="CCCCCC"/>
-              <w:bottom w:val="single" w:sz="4" w:space="0" w:color="CCCCCC"/>
-              <w:right w:val="single" w:sz="4" w:space="0" w:color="CCCCCC"/>
+              <w:top w:val="single" w:sz="4" w:space="0" w:color="A0A0A0"/>
+              <w:left w:val="single" w:sz="4" w:space="0" w:color="A0A0A0"/>
+              <w:bottom w:val="single" w:sz="4" w:space="0" w:color="A0A0A0"/>
+              <w:right w:val="single" w:sz="4" w:space="0" w:color="A0A0A0"/>
             </w:tcBorders>
           </w:tcPr>
           <w:p>
             <w:pPr>
-              <w:spacing w:before="60" w:after="60" w:line="276" w:lineRule="auto"/>
-              <w:ind w:firstLine="0"/>
-              <w:jc w:val="left"/>
+              <w:spacing w:line="276" w:lineRule="auto" w:before="60" w:after="60"/>
             </w:pPr>
             <w:r>
               <w:rPr>
                 <w:rFonts w:ascii="Times New Roman" w:hAnsi="Times New Roman"/>
-                <w:b w:val="0"/>
-                <w:i w:val="0"/>
                 <w:sz w:val="20"/>
               </w:rPr>
-              <w:t>Sonuç Bölümünün Yazılması, Biçim Denetimi ve Savunma Sınavı</w:t>
+              <w:t>İP 6: Enstitüye Teslim, İntihal Raporu ve Tez Savunması</w:t>
             </w:r>
           </w:p>
         </w:tc>
         <w:tc>
           <w:tcPr>
-            <w:tcW w:type="dxa" w:w="3402"/>
+            <w:tcW w:type="dxa" w:w="3118"/>
             <w:tcBorders>
-              <w:top w:val="single" w:sz="4" w:space="0" w:color="CCCCCC"/>
-              <w:left w:val="single" w:sz="4" w:space="0" w:color="CCCCCC"/>
-              <w:bottom w:val="single" w:sz="4" w:space="0" w:color="CCCCCC"/>
-              <w:right w:val="single" w:sz="4" w:space="0" w:color="CCCCCC"/>
+              <w:top w:val="single" w:sz="4" w:space="0" w:color="A0A0A0"/>
+              <w:left w:val="single" w:sz="4" w:space="0" w:color="A0A0A0"/>
+              <w:bottom w:val="single" w:sz="4" w:space="0" w:color="A0A0A0"/>
+              <w:right w:val="single" w:sz="4" w:space="0" w:color="A0A0A0"/>
             </w:tcBorders>
           </w:tcPr>
           <w:p>
             <w:pPr>
-              <w:spacing w:before="60" w:after="60" w:line="276" w:lineRule="auto"/>
-              <w:ind w:firstLine="0"/>
+              <w:spacing w:line="276" w:lineRule="auto" w:before="60" w:after="60"/>
               <w:jc w:val="center"/>
             </w:pPr>
             <w:r>
               <w:rPr>
                 <w:rFonts w:ascii="Times New Roman" w:hAnsi="Times New Roman"/>
-                <w:b w:val="0"/>
-                <w:i w:val="0"/>
                 <w:sz w:val="20"/>
               </w:rPr>
-              <w:t>01.07.2026 - 30.09.2026</w:t>
+              <w:t>Temmuz 2026 – Eylül 2026</w:t>
             </w:r>
           </w:p>
         </w:tc>
@@ -1588,23 +1611,24 @@
     </w:p>
     <w:p>
       <w:pPr>
-        <w:spacing w:before="0" w:after="240" w:line="360" w:lineRule="auto"/>
+        <w:spacing w:before="120" w:after="120" w:line="360" w:lineRule="auto"/>
         <w:ind w:firstLine="0"/>
-        <w:jc w:val="left"/>
+        <w:jc w:val="both"/>
       </w:pPr>
       <w:r>
         <w:rPr>
           <w:rFonts w:ascii="Times New Roman" w:hAnsi="Times New Roman"/>
           <w:b w:val="0"/>
-          <w:i/>
-          <w:sz w:val="20"/>
+          <w:i w:val="0"/>
+          <w:sz w:val="24"/>
         </w:rPr>
-        <w:t>(Kılavuz Notu: Kaynakça listesi APA 7. Basım esaslarına uygun olarak asılı girintili ve alfabetik sırada düzenlenmiştir.)</w:t>
+        <w:t>Kaynakça listesi APA 7 (American Psychological Association) standartlarına tam uyumlu olarak, asılı girinti (hanging indent: 1.25 cm) formatında düzenlenmiştir:</w:t>
+        <w:br/>
       </w:r>
     </w:p>
     <w:p>
       <w:pPr>
-        <w:spacing w:before="60" w:after="60" w:line="276" w:lineRule="auto"/>
+        <w:spacing w:before="80" w:after="80" w:line="276" w:lineRule="auto"/>
         <w:ind w:left="709" w:hanging="709"/>
         <w:jc w:val="both"/>
       </w:pPr>
@@ -1613,12 +1637,40 @@
           <w:rFonts w:ascii="Times New Roman" w:hAnsi="Times New Roman"/>
           <w:sz w:val="22"/>
         </w:rPr>
-        <w:t>Aghion, P., &amp; Howitt, P. (1992). A model of growth through creative destruction. Econometrica, 60(2), 323–351. https://doi.org/10.2307/2951599</w:t>
+        <w:t>Acemoglu, D. (2002). Directed technical change. The Review of Economic Studies, 69(4), 781-809. https://doi.org/10.1111/1467-937X.00226</w:t>
       </w:r>
     </w:p>
     <w:p>
       <w:pPr>
-        <w:spacing w:before="60" w:after="60" w:line="276" w:lineRule="auto"/>
+        <w:spacing w:before="80" w:after="80" w:line="276" w:lineRule="auto"/>
+        <w:ind w:left="709" w:hanging="709"/>
+        <w:jc w:val="both"/>
+      </w:pPr>
+      <w:r>
+        <w:rPr>
+          <w:rFonts w:ascii="Times New Roman" w:hAnsi="Times New Roman"/>
+          <w:sz w:val="22"/>
+        </w:rPr>
+        <w:t>Aghion, P., &amp; Howitt, P. (1992). A model of growth through creative destruction. Econometrica, 60(2), 323-351. https://doi.org/10.2307/2951599</w:t>
+      </w:r>
+    </w:p>
+    <w:p>
+      <w:pPr>
+        <w:spacing w:before="80" w:after="80" w:line="276" w:lineRule="auto"/>
+        <w:ind w:left="709" w:hanging="709"/>
+        <w:jc w:val="both"/>
+      </w:pPr>
+      <w:r>
+        <w:rPr>
+          <w:rFonts w:ascii="Times New Roman" w:hAnsi="Times New Roman"/>
+          <w:sz w:val="22"/>
+        </w:rPr>
+        <w:t>Almeida, P., &amp; Kogut, B. (1999). Localization of knowledge and the mobility of engineers in regional networks. Management Science, 45(7), 905-917. https://doi.org/10.1287/mnsc.45.7.905</w:t>
+      </w:r>
+    </w:p>
+    <w:p>
+      <w:pPr>
+        <w:spacing w:before="80" w:after="80" w:line="276" w:lineRule="auto"/>
         <w:ind w:left="709" w:hanging="709"/>
         <w:jc w:val="both"/>
       </w:pPr>
@@ -1632,7 +1684,7 @@
     </w:p>
     <w:p>
       <w:pPr>
-        <w:spacing w:before="60" w:after="60" w:line="276" w:lineRule="auto"/>
+        <w:spacing w:before="80" w:after="80" w:line="276" w:lineRule="auto"/>
         <w:ind w:left="709" w:hanging="709"/>
         <w:jc w:val="both"/>
       </w:pPr>
@@ -1641,12 +1693,12 @@
           <w:rFonts w:ascii="Times New Roman" w:hAnsi="Times New Roman"/>
           <w:sz w:val="22"/>
         </w:rPr>
-        <w:t>Bloom, N., Schankerman, M., &amp; Van Reenen, J. (2013). Identifying technology spillovers and product market rivalry. Econometrica, 81(4), 1347–1393. https://doi.org/10.3982/ecta9466</w:t>
+        <w:t>Bloom, N., Schankerman, M., &amp; Van Reenen, J. (2013). Identifying technology spillovers and product market rivalry. Econometrica, 81(4), 1347-1393. https://doi.org/10.3982/ECTA9466</w:t>
       </w:r>
     </w:p>
     <w:p>
       <w:pPr>
-        <w:spacing w:before="60" w:after="60" w:line="276" w:lineRule="auto"/>
+        <w:spacing w:before="80" w:after="80" w:line="276" w:lineRule="auto"/>
         <w:ind w:left="709" w:hanging="709"/>
         <w:jc w:val="both"/>
       </w:pPr>
@@ -1655,12 +1707,12 @@
           <w:rFonts w:ascii="Times New Roman" w:hAnsi="Times New Roman"/>
           <w:sz w:val="22"/>
         </w:rPr>
-        <w:t>Deger, S., &amp; Sen, S. (1983). Military expenditure, spin-off and economic development. Journal of Development Economics, 13(1–2), 67–83. https://doi.org/10.1016/0304-3878(83)90050-4</w:t>
+        <w:t>Cohen, W. M., &amp; Levinthal, D. A. (1990). Absorptive capacity: A new perspective on learning and innovation. Administrative Science Quarterly, 35(1), 128-152. https://doi.org/10.2307/2393553</w:t>
       </w:r>
     </w:p>
     <w:p>
       <w:pPr>
-        <w:spacing w:before="60" w:after="60" w:line="276" w:lineRule="auto"/>
+        <w:spacing w:before="80" w:after="80" w:line="276" w:lineRule="auto"/>
         <w:ind w:left="709" w:hanging="709"/>
         <w:jc w:val="both"/>
       </w:pPr>
@@ -1669,12 +1721,12 @@
           <w:rFonts w:ascii="Times New Roman" w:hAnsi="Times New Roman"/>
           <w:sz w:val="22"/>
         </w:rPr>
-        <w:t>Dunne, J. P., &amp; Smith, R. P. (1990). Military expenditure and unemployment in the OECD. Defence Economics, 1(1), 57–73. https://doi.org/10.1080/10430719008404651</w:t>
+        <w:t>Cragg, J. G. (1971). Some statistical models for limited dependent variables with application to the demand for durable goods. Econometrica, 39(5), 829-844. https://doi.org/10.2307/1909582</w:t>
       </w:r>
     </w:p>
     <w:p>
       <w:pPr>
-        <w:spacing w:before="60" w:after="60" w:line="276" w:lineRule="auto"/>
+        <w:spacing w:before="80" w:after="80" w:line="276" w:lineRule="auto"/>
         <w:ind w:left="709" w:hanging="709"/>
         <w:jc w:val="both"/>
       </w:pPr>
@@ -1683,12 +1735,12 @@
           <w:rFonts w:ascii="Times New Roman" w:hAnsi="Times New Roman"/>
           <w:sz w:val="22"/>
         </w:rPr>
-        <w:t>Griliches, Z. (1979). Issues in assessing the contribution of research and development to productivity growth. The Bell Journal of Economics, 10(1), 92–116. https://doi.org/10.2307/3003321</w:t>
+        <w:t>Deger, S., &amp; Sen, S. (1983). Military expenditure, spin-off and economic development. Journal of Development Economics, 13(1-2), 67-83. https://doi.org/10.1016/0304-3878(83)90050-X</w:t>
       </w:r>
     </w:p>
     <w:p>
       <w:pPr>
-        <w:spacing w:before="60" w:after="60" w:line="276" w:lineRule="auto"/>
+        <w:spacing w:before="80" w:after="80" w:line="276" w:lineRule="auto"/>
         <w:ind w:left="709" w:hanging="709"/>
         <w:jc w:val="both"/>
       </w:pPr>
@@ -1697,12 +1749,40 @@
           <w:rFonts w:ascii="Times New Roman" w:hAnsi="Times New Roman"/>
           <w:sz w:val="22"/>
         </w:rPr>
-        <w:t>Griliches, Z. (1990). Patent statistics as economic indicators: A survey. Journal of Economic Literature, 28(4), 1661–1707.</w:t>
+        <w:t>Dunne, J. P. (1990). Military expenditure and unemployment in the OECD. Defence Economics, 1(1), 57-73. https://doi.org/10.1080/10430719008404652</w:t>
       </w:r>
     </w:p>
     <w:p>
       <w:pPr>
-        <w:spacing w:before="60" w:after="60" w:line="276" w:lineRule="auto"/>
+        <w:spacing w:before="80" w:after="80" w:line="276" w:lineRule="auto"/>
+        <w:ind w:left="709" w:hanging="709"/>
+        <w:jc w:val="both"/>
+      </w:pPr>
+      <w:r>
+        <w:rPr>
+          <w:rFonts w:ascii="Times New Roman" w:hAnsi="Times New Roman"/>
+          <w:sz w:val="22"/>
+        </w:rPr>
+        <w:t>Griliches, Z. (1979). Issues in assessing the contribution of research and development to productivity growth. The Bell Journal of Economics, 10(1), 92-116. https://doi.org/10.2307/3003321</w:t>
+      </w:r>
+    </w:p>
+    <w:p>
+      <w:pPr>
+        <w:spacing w:before="80" w:after="80" w:line="276" w:lineRule="auto"/>
+        <w:ind w:left="709" w:hanging="709"/>
+        <w:jc w:val="both"/>
+      </w:pPr>
+      <w:r>
+        <w:rPr>
+          <w:rFonts w:ascii="Times New Roman" w:hAnsi="Times New Roman"/>
+          <w:sz w:val="22"/>
+        </w:rPr>
+        <w:t>Griliches, Z. (1990). Patent statistics as economic indicators: A survey. Journal of Economic Literature, 28(4), 1661-1707.</w:t>
+      </w:r>
+    </w:p>
+    <w:p>
+      <w:pPr>
+        <w:spacing w:before="80" w:after="80" w:line="276" w:lineRule="auto"/>
         <w:ind w:left="709" w:hanging="709"/>
         <w:jc w:val="both"/>
       </w:pPr>
@@ -1716,7 +1796,7 @@
     </w:p>
     <w:p>
       <w:pPr>
-        <w:spacing w:before="60" w:after="60" w:line="276" w:lineRule="auto"/>
+        <w:spacing w:before="80" w:after="80" w:line="276" w:lineRule="auto"/>
         <w:ind w:left="709" w:hanging="709"/>
         <w:jc w:val="both"/>
       </w:pPr>
@@ -1725,12 +1805,12 @@
           <w:rFonts w:ascii="Times New Roman" w:hAnsi="Times New Roman"/>
           <w:sz w:val="22"/>
         </w:rPr>
-        <w:t>Hall, B. H., Jaffe, A., &amp; Trajtenberg, M. (2005). Market value and patent citations. RAND Journal of Economics, 36(1), 16–38.</w:t>
+        <w:t>Hall, B. H., Jaffe, A. B., &amp; Trajtenberg, M. (2005). Market value and patent citations. The RAND Journal of Economics, 36(1), 16-38.</w:t>
       </w:r>
     </w:p>
     <w:p>
       <w:pPr>
-        <w:spacing w:before="60" w:after="60" w:line="276" w:lineRule="auto"/>
+        <w:spacing w:before="80" w:after="80" w:line="276" w:lineRule="auto"/>
         <w:ind w:left="709" w:hanging="709"/>
         <w:jc w:val="both"/>
       </w:pPr>
@@ -1739,12 +1819,12 @@
           <w:rFonts w:ascii="Times New Roman" w:hAnsi="Times New Roman"/>
           <w:sz w:val="22"/>
         </w:rPr>
-        <w:t>Hausman, J., Hall, B. H., &amp; Griliches, Z. (1984). Econometric models for count data with an application to the patents-R&amp;D relationship. Econometrica, 52(4), 909–938. https://doi.org/10.2307/1911191</w:t>
+        <w:t>Jaffe, A. B. (1986). Technological opportunity and spillovers of R&amp;D: Evidence from firms' patents, profits, and market value. The American Economic Review, 76(5), 984-1001.</w:t>
       </w:r>
     </w:p>
     <w:p>
       <w:pPr>
-        <w:spacing w:before="60" w:after="60" w:line="276" w:lineRule="auto"/>
+        <w:spacing w:before="80" w:after="80" w:line="276" w:lineRule="auto"/>
         <w:ind w:left="709" w:hanging="709"/>
         <w:jc w:val="both"/>
       </w:pPr>
@@ -1753,12 +1833,12 @@
           <w:rFonts w:ascii="Times New Roman" w:hAnsi="Times New Roman"/>
           <w:sz w:val="22"/>
         </w:rPr>
-        <w:t>Jaffe, A. B. (1986). Technological opportunity and spillovers of R&amp;D: Evidence from firms' patents, profits, and market value. American Economic Review, 76(5), 984–1001.</w:t>
+        <w:t>Jaffe, A. B., Trajtenberg, M., &amp; Henderson, R. (1993). Geographic localization of knowledge spillovers as evidenced by patent citations. The Quarterly Journal of Economics, 108(3), 577-598. https://doi.org/10.2307/2118401</w:t>
       </w:r>
     </w:p>
     <w:p>
       <w:pPr>
-        <w:spacing w:before="60" w:after="60" w:line="276" w:lineRule="auto"/>
+        <w:spacing w:before="80" w:after="80" w:line="276" w:lineRule="auto"/>
         <w:ind w:left="709" w:hanging="709"/>
         <w:jc w:val="both"/>
       </w:pPr>
@@ -1767,12 +1847,12 @@
           <w:rFonts w:ascii="Times New Roman" w:hAnsi="Times New Roman"/>
           <w:sz w:val="22"/>
         </w:rPr>
-        <w:t>Jaffe, A. B. (1993). Geographic localization of knowledge spillovers as evidenced by patent citations. Quarterly Journal of Economics, 108(3), 577–598. https://doi.org/10.2307/2118401</w:t>
+        <w:t>LeSage, J. P., &amp; Pace, R. K. (2009). Introduction to spatial econometrics. CRC Press.</w:t>
       </w:r>
     </w:p>
     <w:p>
       <w:pPr>
-        <w:spacing w:before="60" w:after="60" w:line="276" w:lineRule="auto"/>
+        <w:spacing w:before="80" w:after="80" w:line="276" w:lineRule="auto"/>
         <w:ind w:left="709" w:hanging="709"/>
         <w:jc w:val="both"/>
       </w:pPr>
@@ -1781,12 +1861,12 @@
           <w:rFonts w:ascii="Times New Roman" w:hAnsi="Times New Roman"/>
           <w:sz w:val="22"/>
         </w:rPr>
-        <w:t>Moretti, E., Steinwender, C., &amp; Van Reenen, J. (2023). The intellectual spoils of war? Defense R&amp;D, productivity and international spillovers. The Economic Journal, 133(656), 2824–2858. https://doi.org/10.1093/ej/uead052</w:t>
+        <w:t>Moretti, E., Steinwender, C., &amp; Van Reenen, J. (2023). The intellectual spoils of war? Defense R&amp;D, productivity and international spillovers. The Review of Economics and Statistics, 1-45. https://doi.org/10.1162/rest_a_01377</w:t>
       </w:r>
     </w:p>
     <w:p>
       <w:pPr>
-        <w:spacing w:before="60" w:after="60" w:line="276" w:lineRule="auto"/>
+        <w:spacing w:before="80" w:after="80" w:line="276" w:lineRule="auto"/>
         <w:ind w:left="709" w:hanging="709"/>
         <w:jc w:val="both"/>
       </w:pPr>
@@ -1795,12 +1875,12 @@
           <w:rFonts w:ascii="Times New Roman" w:hAnsi="Times New Roman"/>
           <w:sz w:val="22"/>
         </w:rPr>
-        <w:t>Mowery, D. C. (2010). Military R&amp;D and innovation. In B. H. Hall &amp; N. Rosenberg (Eds.), Handbook of the Economics of Innovation (Vol. 2, pp. 1219–1256). North-Holland. https://doi.org/10.1016/S0169-7218(10)02013-7</w:t>
+        <w:t>Mowery, D. C. (2010). Military R&amp;D and innovation. In B. H. Hall &amp; N. Rosenberg (Eds.), Handbook of the Economics of Innovation (Vol. 2, pp. 1219-1256). North-Holland. https://doi.org/10.1016/S0169-7218(10)02013-7</w:t>
       </w:r>
     </w:p>
     <w:p>
       <w:pPr>
-        <w:spacing w:before="60" w:after="60" w:line="276" w:lineRule="auto"/>
+        <w:spacing w:before="80" w:after="80" w:line="276" w:lineRule="auto"/>
         <w:ind w:left="709" w:hanging="709"/>
         <w:jc w:val="both"/>
       </w:pPr>
@@ -1809,12 +1889,12 @@
           <w:rFonts w:ascii="Times New Roman" w:hAnsi="Times New Roman"/>
           <w:sz w:val="22"/>
         </w:rPr>
-        <w:t>Romer, P. M. (1990). Endogenous technological change. Journal of Political Economy, 98(5, Part 2), S71–S102. https://doi.org/10.1086/261725</w:t>
+        <w:t>Romer, P. M. (1990). Endogenous technological change. Journal of Political Economy, 98(5, Part 2), S71-S102. https://doi.org/10.1086/261725</w:t>
       </w:r>
     </w:p>
     <w:p>
       <w:pPr>
-        <w:spacing w:before="60" w:after="60" w:line="276" w:lineRule="auto"/>
+        <w:spacing w:before="80" w:after="80" w:line="276" w:lineRule="auto"/>
         <w:ind w:left="709" w:hanging="709"/>
         <w:jc w:val="both"/>
       </w:pPr>
@@ -1823,35 +1903,7 @@
           <w:rFonts w:ascii="Times New Roman" w:hAnsi="Times New Roman"/>
           <w:sz w:val="22"/>
         </w:rPr>
-        <w:t>Ruttan, V. W. (2006). Is war necessary for economic growth? Military procurement and technology development. Oxford University Press.</w:t>
-      </w:r>
-    </w:p>
-    <w:p>
-      <w:pPr>
-        <w:spacing w:before="60" w:after="60" w:line="276" w:lineRule="auto"/>
-        <w:ind w:left="709" w:hanging="709"/>
-        <w:jc w:val="both"/>
-      </w:pPr>
-      <w:r>
-        <w:rPr>
-          <w:rFonts w:ascii="Times New Roman" w:hAnsi="Times New Roman"/>
-          <w:sz w:val="22"/>
-        </w:rPr>
-        <w:t>Santos Silva, J. M. C., &amp; Tenreyro, S. (2006). The log of gravity. The Review of Economics and Statistics, 88(4), 641–658. https://doi.org/10.1162/rest.88.4.641</w:t>
-      </w:r>
-    </w:p>
-    <w:p>
-      <w:pPr>
-        <w:spacing w:before="60" w:after="60" w:line="276" w:lineRule="auto"/>
-        <w:ind w:left="709" w:hanging="709"/>
-        <w:jc w:val="both"/>
-      </w:pPr>
-      <w:r>
-        <w:rPr>
-          <w:rFonts w:ascii="Times New Roman" w:hAnsi="Times New Roman"/>
-          <w:sz w:val="22"/>
-        </w:rPr>
-        <w:t>Wooldridge, J. M. (2010). Econometric analysis of cross section and panel data (2nd ed.). MIT Press.</w:t>
+        <w:t>Santos Silva, J. M. C., &amp; Tenreyro, S. (2006). The log of gravity. The Review of Economics and Statistics, 88(4), 641-658. https://doi.org/10.1162/rest.88.4.641</w:t>
       </w:r>
     </w:p>
     <w:sectPr>

</xml_diff>

<commit_message>
docs(thesis): update official proposal timeline to 5-month accelerated completion plan (September 2026 - January 2027)
</commit_message>
<xml_diff>
--- a/TEZ_ONERI_FORMU_AHBV.docx
+++ b/TEZ_ONERI_FORMU_AHBV.docx
@@ -268,7 +268,7 @@
           <w:i w:val="0"/>
           <w:sz w:val="24"/>
         </w:rPr>
-        <w:t>Ankara, 2026</w:t>
+        <w:t>Ankara, Ocak 2027</w:t>
       </w:r>
     </w:p>
     <w:p>
@@ -1313,7 +1313,7 @@
                 <w:rFonts w:ascii="Times New Roman" w:hAnsi="Times New Roman"/>
                 <w:sz w:val="20"/>
               </w:rPr>
-              <w:t>İP 1: Tez Önerisinin Kesinleşmesi ve Enstitü Onayı</w:t>
+              <w:t>İP 1: Tez Önerisi Onayı, Enstitü Kaydı ve Literatür Sentezi</w:t>
             </w:r>
           </w:p>
         </w:tc>
@@ -1337,7 +1337,7 @@
                 <w:rFonts w:ascii="Times New Roman" w:hAnsi="Times New Roman"/>
                 <w:sz w:val="20"/>
               </w:rPr>
-              <w:t>Eylül 2025 – Ekim 2025</w:t>
+              <w:t>Eylül 2026</w:t>
             </w:r>
           </w:p>
         </w:tc>
@@ -1362,7 +1362,7 @@
                 <w:rFonts w:ascii="Times New Roman" w:hAnsi="Times New Roman"/>
                 <w:sz w:val="20"/>
               </w:rPr>
-              <w:t>İP 2: Literatür Sentezi ve Kuramsal Çerçevenin Yazımı</w:t>
+              <w:t>İP 2: Kuramsal Çerçeve ve Yöntem Bölümlerinin Yazımı (Bölüm 1, 2 ve 3)</w:t>
             </w:r>
           </w:p>
         </w:tc>
@@ -1386,7 +1386,7 @@
                 <w:rFonts w:ascii="Times New Roman" w:hAnsi="Times New Roman"/>
                 <w:sz w:val="20"/>
               </w:rPr>
-              <w:t>Kasım 2025 – Aralık 2025</w:t>
+              <w:t>Ekim 2026</w:t>
             </w:r>
           </w:p>
         </w:tc>
@@ -1411,7 +1411,7 @@
                 <w:rFonts w:ascii="Times New Roman" w:hAnsi="Times New Roman"/>
                 <w:sz w:val="20"/>
               </w:rPr>
-              <w:t>İP 3: TÜRKPATENT 93.240 Verisinin Derlenmesi ve Jaffe Matrisi</w:t>
+              <w:t>İP 3: TÜRKPATENT 93.240 Verisi Ekonometrik Modellemesi ve Bölüm 4 Çıktıları</w:t>
             </w:r>
           </w:p>
         </w:tc>
@@ -1435,7 +1435,7 @@
                 <w:rFonts w:ascii="Times New Roman" w:hAnsi="Times New Roman"/>
                 <w:sz w:val="20"/>
               </w:rPr>
-              <w:t>Ocak 2026 – Şubat 2026</w:t>
+              <w:t>Kasım 2026</w:t>
             </w:r>
           </w:p>
         </w:tc>
@@ -1460,7 +1460,7 @@
                 <w:rFonts w:ascii="Times New Roman" w:hAnsi="Times New Roman"/>
                 <w:sz w:val="20"/>
               </w:rPr>
-              <w:t>İP 4: Ekonometrik Modelleme (Hurdle, Spatial, DiD, Cox)</w:t>
+              <w:t>İP 4: Bölüm 5 (Sonuç ve Politika Önerileri) ve Taslak Metnin Danışmana Sunumu</w:t>
             </w:r>
           </w:p>
         </w:tc>
@@ -1484,7 +1484,7 @@
                 <w:rFonts w:ascii="Times New Roman" w:hAnsi="Times New Roman"/>
                 <w:sz w:val="20"/>
               </w:rPr>
-              <w:t>Mart 2026 – Nisan 2026</w:t>
+              <w:t>Aralık 2026</w:t>
             </w:r>
           </w:p>
         </w:tc>
@@ -1509,7 +1509,7 @@
                 <w:rFonts w:ascii="Times New Roman" w:hAnsi="Times New Roman"/>
                 <w:sz w:val="20"/>
               </w:rPr>
-              <w:t>İP 5: Tez Metninin Tamamlanması ve Danışman İncelemesi</w:t>
+              <w:t>İP 5: Danışman Düzeltmeleri, Turnitin Benzerlik Raporu ve Tez Savunması</w:t>
             </w:r>
           </w:p>
         </w:tc>
@@ -1533,56 +1533,7 @@
                 <w:rFonts w:ascii="Times New Roman" w:hAnsi="Times New Roman"/>
                 <w:sz w:val="20"/>
               </w:rPr>
-              <w:t>Mayıs 2026 – Haziran 2026</w:t>
-            </w:r>
-          </w:p>
-        </w:tc>
-      </w:tr>
-      <w:tr>
-        <w:tc>
-          <w:tcPr>
-            <w:tcW w:type="dxa" w:w="5953"/>
-            <w:tcBorders>
-              <w:top w:val="single" w:sz="4" w:space="0" w:color="A0A0A0"/>
-              <w:left w:val="single" w:sz="4" w:space="0" w:color="A0A0A0"/>
-              <w:bottom w:val="single" w:sz="4" w:space="0" w:color="A0A0A0"/>
-              <w:right w:val="single" w:sz="4" w:space="0" w:color="A0A0A0"/>
-            </w:tcBorders>
-          </w:tcPr>
-          <w:p>
-            <w:pPr>
-              <w:spacing w:line="276" w:lineRule="auto" w:before="60" w:after="60"/>
-            </w:pPr>
-            <w:r>
-              <w:rPr>
-                <w:rFonts w:ascii="Times New Roman" w:hAnsi="Times New Roman"/>
-                <w:sz w:val="20"/>
-              </w:rPr>
-              <w:t>İP 6: Enstitüye Teslim, İntihal Raporu ve Tez Savunması</w:t>
-            </w:r>
-          </w:p>
-        </w:tc>
-        <w:tc>
-          <w:tcPr>
-            <w:tcW w:type="dxa" w:w="3118"/>
-            <w:tcBorders>
-              <w:top w:val="single" w:sz="4" w:space="0" w:color="A0A0A0"/>
-              <w:left w:val="single" w:sz="4" w:space="0" w:color="A0A0A0"/>
-              <w:bottom w:val="single" w:sz="4" w:space="0" w:color="A0A0A0"/>
-              <w:right w:val="single" w:sz="4" w:space="0" w:color="A0A0A0"/>
-            </w:tcBorders>
-          </w:tcPr>
-          <w:p>
-            <w:pPr>
-              <w:spacing w:line="276" w:lineRule="auto" w:before="60" w:after="60"/>
-              <w:jc w:val="center"/>
-            </w:pPr>
-            <w:r>
-              <w:rPr>
-                <w:rFonts w:ascii="Times New Roman" w:hAnsi="Times New Roman"/>
-                <w:sz w:val="20"/>
-              </w:rPr>
-              <w:t>Temmuz 2026 – Eylül 2026</w:t>
+              <w:t>Ocak 2027</w:t>
             </w:r>
           </w:p>
         </w:tc>

</xml_diff>